<commit_message>
docs: preserve disclosure TOC field
</commit_message>
<xml_diff>
--- a/docs/patents/point-mass-trajectory-reconstruction-technical-disclosure.docx
+++ b/docs/patents/point-mass-trajectory-reconstruction-technical-disclosure.docx
@@ -2,158 +2,184 @@
 <file path=word/document.xml><?xml version="1.0" encoding="utf-8"?>
 <w:document xmlns:ns1="http://schemas.openxmlformats.org/officeDocument/2006/math" xmlns:r="http://schemas.openxmlformats.org/officeDocument/2006/relationships" xmlns:w="http://schemas.openxmlformats.org/wordprocessingml/2006/main">
   <w:body>
-    <w:p>
-      <w:pPr>
-        <w:pStyle w:val="TOCHeading"/>
-      </w:pPr>
-      <w:r>
-        <w:t>目录</w:t>
-      </w:r>
-    </w:p>
-    <w:p>
-      <w:pPr>
-        <w:pStyle w:val="TOC1"/>
-      </w:pPr>
-      <w:r>
-        <w:t>1. 发明名称</w:t>
-      </w:r>
-    </w:p>
-    <w:p>
-      <w:pPr>
-        <w:pStyle w:val="TOC1"/>
-      </w:pPr>
-      <w:r>
-        <w:t>2. 技术领域</w:t>
-      </w:r>
-    </w:p>
-    <w:p>
-      <w:pPr>
-        <w:pStyle w:val="TOC1"/>
-      </w:pPr>
-      <w:r>
-        <w:t>3. 背景技术</w:t>
-      </w:r>
-    </w:p>
-    <w:p>
-      <w:pPr>
-        <w:pStyle w:val="TOC1"/>
-      </w:pPr>
-      <w:r>
-        <w:t>4. 现有技术存在的问题</w:t>
-      </w:r>
-    </w:p>
-    <w:p>
-      <w:pPr>
-        <w:pStyle w:val="TOC1"/>
-      </w:pPr>
-      <w:r>
-        <w:t>5. 发明目的</w:t>
-      </w:r>
-    </w:p>
-    <w:p>
-      <w:pPr>
-        <w:pStyle w:val="TOC1"/>
-      </w:pPr>
-      <w:r>
-        <w:t>6. 技术方案总体说明</w:t>
-      </w:r>
-    </w:p>
-    <w:p>
-      <w:pPr>
-        <w:pStyle w:val="TOC1"/>
-      </w:pPr>
-      <w:r>
-        <w:t>7. 数学模型与适用条件</w:t>
-      </w:r>
-    </w:p>
-    <w:p>
-      <w:pPr>
-        <w:pStyle w:val="TOC1"/>
-      </w:pPr>
-      <w:r>
-        <w:t>8. 候选航点速度与分层图构建</w:t>
-      </w:r>
-    </w:p>
-    <w:p>
-      <w:pPr>
-        <w:pStyle w:val="TOC1"/>
-      </w:pPr>
-      <w:r>
-        <w:t>9. 单轴时间最优转移原理及完整推导</w:t>
-      </w:r>
-    </w:p>
-    <w:p>
-      <w:pPr>
-        <w:pStyle w:val="TOC1"/>
-      </w:pPr>
-      <w:r>
-        <w:t>10. 三轴共同时间重分配与可行性判定</w:t>
-      </w:r>
-    </w:p>
-    <w:p>
-      <w:pPr>
-        <w:pStyle w:val="TOC1"/>
-      </w:pPr>
-      <w:r>
-        <w:t>11. 分层图动态规划与全局最优性证明</w:t>
-      </w:r>
-    </w:p>
-    <w:p>
-      <w:pPr>
-        <w:pStyle w:val="TOC1"/>
-      </w:pPr>
-      <w:r>
-        <w:t>12. 轨迹解析重构及连续性说明</w:t>
-      </w:r>
-    </w:p>
-    <w:p>
-      <w:pPr>
-        <w:pStyle w:val="TOC1"/>
-      </w:pPr>
-      <w:r>
-        <w:t>13. 退化情形、数值容差和异常处理</w:t>
-      </w:r>
-    </w:p>
-    <w:p>
-      <w:pPr>
-        <w:pStyle w:val="TOC1"/>
-      </w:pPr>
-      <w:r>
-        <w:t>14. 完整算法伪代码</w:t>
-      </w:r>
-    </w:p>
-    <w:p>
-      <w:pPr>
-        <w:pStyle w:val="TOC1"/>
-      </w:pPr>
-      <w:r>
-        <w:t>15. 具体实施例</w:t>
-      </w:r>
-    </w:p>
-    <w:p>
-      <w:pPr>
-        <w:pStyle w:val="TOC1"/>
-      </w:pPr>
-      <w:r>
-        <w:t>16. 有益效果</w:t>
-      </w:r>
-    </w:p>
-    <w:p>
-      <w:pPr>
-        <w:pStyle w:val="TOC1"/>
-      </w:pPr>
-      <w:r>
-        <w:t>17. 附图说明</w:t>
-      </w:r>
-    </w:p>
-    <w:p>
-      <w:pPr>
-        <w:pStyle w:val="TOC1"/>
-      </w:pPr>
-      <w:r>
-        <w:t>18. 仿真验证与效果说明（预留）</w:t>
-      </w:r>
-    </w:p>
+    <w:sdt>
+      <w:sdtPr>
+        <w:docPartObj>
+          <w:docPartGallery w:val="Table of Contents"/>
+          <w:docPartUnique/>
+        </w:docPartObj>
+      </w:sdtPr>
+      <w:sdtContent>
+        <w:p>
+          <w:pPr>
+            <w:pStyle w:val="TOCHeading"/>
+          </w:pPr>
+          <w:r>
+            <w:t>目录</w:t>
+          </w:r>
+        </w:p>
+        <w:p>
+          <w:r>
+            <w:fldChar w:fldCharType="begin"/>
+          </w:r>
+          <w:r>
+            <w:instrText xml:space="preserve"> TOC \o "1-3" \h \z \u </w:instrText>
+          </w:r>
+          <w:r>
+            <w:fldChar w:fldCharType="separate"/>
+          </w:r>
+        </w:p>
+        <w:p>
+          <w:pPr>
+            <w:pStyle w:val="TOC1"/>
+          </w:pPr>
+          <w:r>
+            <w:t>1. 发明名称</w:t>
+          </w:r>
+        </w:p>
+        <w:p>
+          <w:pPr>
+            <w:pStyle w:val="TOC1"/>
+          </w:pPr>
+          <w:r>
+            <w:t>2. 技术领域</w:t>
+          </w:r>
+        </w:p>
+        <w:p>
+          <w:pPr>
+            <w:pStyle w:val="TOC1"/>
+          </w:pPr>
+          <w:r>
+            <w:t>3. 背景技术</w:t>
+          </w:r>
+        </w:p>
+        <w:p>
+          <w:pPr>
+            <w:pStyle w:val="TOC1"/>
+          </w:pPr>
+          <w:r>
+            <w:t>4. 现有技术存在的问题</w:t>
+          </w:r>
+        </w:p>
+        <w:p>
+          <w:pPr>
+            <w:pStyle w:val="TOC1"/>
+          </w:pPr>
+          <w:r>
+            <w:t>5. 发明目的</w:t>
+          </w:r>
+        </w:p>
+        <w:p>
+          <w:pPr>
+            <w:pStyle w:val="TOC1"/>
+          </w:pPr>
+          <w:r>
+            <w:t>6. 技术方案总体说明</w:t>
+          </w:r>
+        </w:p>
+        <w:p>
+          <w:pPr>
+            <w:pStyle w:val="TOC1"/>
+          </w:pPr>
+          <w:r>
+            <w:t>7. 数学模型与适用条件</w:t>
+          </w:r>
+        </w:p>
+        <w:p>
+          <w:pPr>
+            <w:pStyle w:val="TOC1"/>
+          </w:pPr>
+          <w:r>
+            <w:t>8. 候选航点速度与分层图构建</w:t>
+          </w:r>
+        </w:p>
+        <w:p>
+          <w:pPr>
+            <w:pStyle w:val="TOC1"/>
+          </w:pPr>
+          <w:r>
+            <w:t>9. 单轴时间最优转移原理及完整推导</w:t>
+          </w:r>
+        </w:p>
+        <w:p>
+          <w:pPr>
+            <w:pStyle w:val="TOC1"/>
+          </w:pPr>
+          <w:r>
+            <w:t>10. 三轴共同时间重分配与可行性判定</w:t>
+          </w:r>
+        </w:p>
+        <w:p>
+          <w:pPr>
+            <w:pStyle w:val="TOC1"/>
+          </w:pPr>
+          <w:r>
+            <w:t>11. 分层图动态规划与全局最优性证明</w:t>
+          </w:r>
+        </w:p>
+        <w:p>
+          <w:pPr>
+            <w:pStyle w:val="TOC1"/>
+          </w:pPr>
+          <w:r>
+            <w:t>12. 轨迹解析重构及连续性说明</w:t>
+          </w:r>
+        </w:p>
+        <w:p>
+          <w:pPr>
+            <w:pStyle w:val="TOC1"/>
+          </w:pPr>
+          <w:r>
+            <w:t>13. 退化情形、数值容差和异常处理</w:t>
+          </w:r>
+        </w:p>
+        <w:p>
+          <w:pPr>
+            <w:pStyle w:val="TOC1"/>
+          </w:pPr>
+          <w:r>
+            <w:t>14. 完整算法伪代码</w:t>
+          </w:r>
+        </w:p>
+        <w:p>
+          <w:pPr>
+            <w:pStyle w:val="TOC1"/>
+          </w:pPr>
+          <w:r>
+            <w:t>15. 具体实施例</w:t>
+          </w:r>
+        </w:p>
+        <w:p>
+          <w:pPr>
+            <w:pStyle w:val="TOC1"/>
+          </w:pPr>
+          <w:r>
+            <w:t>16. 有益效果</w:t>
+          </w:r>
+        </w:p>
+        <w:p>
+          <w:pPr>
+            <w:pStyle w:val="TOC1"/>
+          </w:pPr>
+          <w:r>
+            <w:t>17. 附图说明</w:t>
+          </w:r>
+        </w:p>
+        <w:p>
+          <w:pPr>
+            <w:pStyle w:val="TOC1"/>
+          </w:pPr>
+          <w:r>
+            <w:t>18. 仿真验证与效果说明（预留）</w:t>
+          </w:r>
+        </w:p>
+        <w:p>
+          <w:r>
+            <w:fldChar w:fldCharType="end"/>
+          </w:r>
+        </w:p>
+      </w:sdtContent>
+    </w:sdt>
     <w:p>
       <w:pPr>
         <w:pStyle w:val="Title"/>
@@ -6288,45 +6314,9 @@
       <w:r>
         <w:t xml:space="preserve">内满足端点，所以</w:t>
       </w:r>
-      <ns1:oMath>
-        <ns1:sSub>
-          <ns1:e>
-            <ns1:r>
-              <ns1:rPr>
-                <ns1:sty ns1:val="p"/>
-                <ns1:scr ns1:val="script"/>
-              </ns1:rPr>
-              <ns1:t>F</ns1:t>
-            </ns1:r>
-          </ns1:e>
-          <ns1:sub>
-            <ns1:r>
-              <ns1:t>r</ns1:t>
-            </ns1:r>
-          </ns1:sub>
-        </ns1:sSub>
-        <ns1:r>
-          <ns1:t>=</ns1:t>
-        </ns1:r>
-        <ns1:r>
-          <ns1:t>[</ns1:t>
-        </ns1:r>
-        <ns1:r>
-          <ns1:t>0</ns1:t>
-        </ns1:r>
-        <ns1:r>
-          <ns1:t>,</ns1:t>
-        </ns1:r>
-        <ns1:r>
-          <ns1:t>+</ns1:t>
-        </ns1:r>
-        <ns1:r>
-          <ns1:t>∞</ns1:t>
-        </ns1:r>
-        <ns1:r>
-          <ns1:t>)</ns1:t>
-        </ns1:r>
-      </ns1:oMath>
+      <w:r>
+        <w:t>F_r=[0,+∞)</w:t>
+      </w:r>
       <w:r>
         <w:t xml:space="preserve">。对于非静止轴，分别求两种名义顺序的可行时间集合并取并集。三维公共时间必须属于</w:t>
       </w:r>
@@ -7543,110 +7533,11 @@
     <w:p>
       <w:pPr>
         <w:pStyle w:val="BodyText"/>
-      </w:pPr>
-      <ns1:oMathPara>
-        <ns1:oMathParaPr>
-          <ns1:jc ns1:val="center"/>
-        </ns1:oMathParaPr>
-        <ns1:oMath>
-          <ns1:r>
-            <ns1:t>g</ns1:t>
-          </ns1:r>
-          <ns1:r>
-            <ns1:t>(</ns1:t>
-          </ns1:r>
-          <ns1:sSub>
-            <ns1:e>
-              <ns1:r>
-                <ns1:t>n</ns1:t>
-              </ns1:r>
-            </ns1:e>
-            <ns1:sub>
-              <ns1:r>
-                <ns1:t>0</ns1:t>
-              </ns1:r>
-              <ns1:r>
-                <ns1:t>,</ns1:t>
-              </ns1:r>
-              <ns1:r>
-                <ns1:t>1</ns1:t>
-              </ns1:r>
-            </ns1:sub>
-          </ns1:sSub>
-          <ns1:r>
-            <ns1:t>)</ns1:t>
-          </ns1:r>
-          <ns1:r>
-            <ns1:t>=</ns1:t>
-          </ns1:r>
-          <ns1:r>
-            <ns1:t>0</ns1:t>
-          </ns1:r>
-          <ns1:r>
-            <ns1:t>，</ns1:t>
-          </ns1:r>
-          <ns1:r>
-            <ns1:t>  </ns1:t>
-          </ns1:r>
-          <ns1:r>
-            <ns1:t>g</ns1:t>
-          </ns1:r>
-          <ns1:r>
-            <ns1:t>(</ns1:t>
-          </ns1:r>
-          <ns1:sSub>
-            <ns1:e>
-              <ns1:r>
-                <ns1:t>n</ns1:t>
-              </ns1:r>
-            </ns1:e>
-            <ns1:sub>
-              <ns1:r>
-                <ns1:t>i</ns1:t>
-              </ns1:r>
-              <ns1:r>
-                <ns1:t>,</ns1:t>
-              </ns1:r>
-              <ns1:r>
-                <ns1:t>k</ns1:t>
-              </ns1:r>
-            </ns1:sub>
-          </ns1:sSub>
-          <ns1:r>
-            <ns1:t>)</ns1:t>
-          </ns1:r>
-          <ns1:r>
-            <ns1:t>=</ns1:t>
-          </ns1:r>
-          <ns1:r>
-            <ns1:t>+</ns1:t>
-          </ns1:r>
-          <ns1:r>
-            <ns1:t>∞</ns1:t>
-          </ns1:r>
-          <ns1:r>
-            <ns1:t> </ns1:t>
-          </ns1:r>
-          <ns1:r>
-            <ns1:t>(</ns1:t>
-          </ns1:r>
-          <ns1:r>
-            <ns1:t>i</ns1:t>
-          </ns1:r>
-          <ns1:r>
-            <ns1:t>&gt;</ns1:t>
-          </ns1:r>
-          <ns1:r>
-            <ns1:t>0</ns1:t>
-          </ns1:r>
-          <ns1:r>
-            <ns1:t>)</ns1:t>
-          </ns1:r>
-          <ns1:r>
-            <ns1:t>。</ns1:t>
-          </ns1:r>
-        </ns1:oMath>
-      </ns1:oMathPara>
+        <w:jc w:val="center"/>
+      </w:pPr>
+      <w:r>
+        <w:t>g(n_0,1)=0，  g(n_i,k)=+∞ (i&gt;0)。</w:t>
+      </w:r>
     </w:p>
     <w:p>
       <w:pPr>

</xml_diff>

<commit_message>
docs: fix disclosure formula compatibility and TOC navigation
</commit_message>
<xml_diff>
--- a/docs/patents/point-mass-trajectory-reconstruction-technical-disclosure.docx
+++ b/docs/patents/point-mass-trajectory-reconstruction-technical-disclosure.docx
@@ -32,146 +32,380 @@
         <w:p>
           <w:pPr>
             <w:pStyle w:val="TOC1"/>
+            <w:tabs>
+              <w:tab w:val="right" w:leader="dot" w:pos="9026"/>
+            </w:tabs>
           </w:pPr>
-          <w:r>
-            <w:t>1. 发明名称</w:t>
-          </w:r>
+          <w:hyperlink w:anchor="DisclosureSection1" w:history="1">
+            <w:r>
+              <w:t>1. 发明名称</w:t>
+            </w:r>
+            <w:r>
+              <w:tab/>
+            </w:r>
+            <w:fldSimple w:instr=" PAGEREF DisclosureSection1 \h ">
+              <w:r>
+                <w:t>2</w:t>
+              </w:r>
+            </w:fldSimple>
+          </w:hyperlink>
         </w:p>
         <w:p>
           <w:pPr>
             <w:pStyle w:val="TOC1"/>
+            <w:tabs>
+              <w:tab w:val="right" w:leader="dot" w:pos="9026"/>
+            </w:tabs>
           </w:pPr>
-          <w:r>
-            <w:t>2. 技术领域</w:t>
-          </w:r>
+          <w:hyperlink w:anchor="DisclosureSection2" w:history="1">
+            <w:r>
+              <w:t>2. 技术领域</w:t>
+            </w:r>
+            <w:r>
+              <w:tab/>
+            </w:r>
+            <w:fldSimple w:instr=" PAGEREF DisclosureSection2 \h ">
+              <w:r>
+                <w:t>2</w:t>
+              </w:r>
+            </w:fldSimple>
+          </w:hyperlink>
         </w:p>
         <w:p>
           <w:pPr>
             <w:pStyle w:val="TOC1"/>
+            <w:tabs>
+              <w:tab w:val="right" w:leader="dot" w:pos="9026"/>
+            </w:tabs>
           </w:pPr>
-          <w:r>
-            <w:t>3. 背景技术</w:t>
-          </w:r>
+          <w:hyperlink w:anchor="DisclosureSection3" w:history="1">
+            <w:r>
+              <w:t>3. 背景技术</w:t>
+            </w:r>
+            <w:r>
+              <w:tab/>
+            </w:r>
+            <w:fldSimple w:instr=" PAGEREF DisclosureSection3 \h ">
+              <w:r>
+                <w:t>3</w:t>
+              </w:r>
+            </w:fldSimple>
+          </w:hyperlink>
         </w:p>
         <w:p>
           <w:pPr>
             <w:pStyle w:val="TOC1"/>
+            <w:tabs>
+              <w:tab w:val="right" w:leader="dot" w:pos="9026"/>
+            </w:tabs>
           </w:pPr>
-          <w:r>
-            <w:t>4. 现有技术存在的问题</w:t>
-          </w:r>
+          <w:hyperlink w:anchor="DisclosureSection4" w:history="1">
+            <w:r>
+              <w:t>4. 现有技术存在的问题</w:t>
+            </w:r>
+            <w:r>
+              <w:tab/>
+            </w:r>
+            <w:fldSimple w:instr=" PAGEREF DisclosureSection4 \h ">
+              <w:r>
+                <w:t>4</w:t>
+              </w:r>
+            </w:fldSimple>
+          </w:hyperlink>
         </w:p>
         <w:p>
           <w:pPr>
             <w:pStyle w:val="TOC1"/>
+            <w:tabs>
+              <w:tab w:val="right" w:leader="dot" w:pos="9026"/>
+            </w:tabs>
           </w:pPr>
-          <w:r>
-            <w:t>5. 发明目的</w:t>
-          </w:r>
+          <w:hyperlink w:anchor="DisclosureSection5" w:history="1">
+            <w:r>
+              <w:t>5. 发明目的</w:t>
+            </w:r>
+            <w:r>
+              <w:tab/>
+            </w:r>
+            <w:fldSimple w:instr=" PAGEREF DisclosureSection5 \h ">
+              <w:r>
+                <w:t>6</w:t>
+              </w:r>
+            </w:fldSimple>
+          </w:hyperlink>
         </w:p>
         <w:p>
           <w:pPr>
             <w:pStyle w:val="TOC1"/>
+            <w:tabs>
+              <w:tab w:val="right" w:leader="dot" w:pos="9026"/>
+            </w:tabs>
           </w:pPr>
-          <w:r>
-            <w:t>6. 技术方案总体说明</w:t>
-          </w:r>
+          <w:hyperlink w:anchor="DisclosureSection6" w:history="1">
+            <w:r>
+              <w:t>6. 技术方案总体说明</w:t>
+            </w:r>
+            <w:r>
+              <w:tab/>
+            </w:r>
+            <w:fldSimple w:instr=" PAGEREF DisclosureSection6 \h ">
+              <w:r>
+                <w:t>6</w:t>
+              </w:r>
+            </w:fldSimple>
+          </w:hyperlink>
         </w:p>
         <w:p>
           <w:pPr>
             <w:pStyle w:val="TOC1"/>
+            <w:tabs>
+              <w:tab w:val="right" w:leader="dot" w:pos="9026"/>
+            </w:tabs>
           </w:pPr>
-          <w:r>
-            <w:t>7. 数学模型与适用条件</w:t>
-          </w:r>
+          <w:hyperlink w:anchor="DisclosureSection7" w:history="1">
+            <w:r>
+              <w:t>7. 数学模型与适用条件</w:t>
+            </w:r>
+            <w:r>
+              <w:tab/>
+            </w:r>
+            <w:fldSimple w:instr=" PAGEREF DisclosureSection7 \h ">
+              <w:r>
+                <w:t>9</w:t>
+              </w:r>
+            </w:fldSimple>
+          </w:hyperlink>
         </w:p>
         <w:p>
           <w:pPr>
             <w:pStyle w:val="TOC1"/>
+            <w:tabs>
+              <w:tab w:val="right" w:leader="dot" w:pos="9026"/>
+            </w:tabs>
           </w:pPr>
-          <w:r>
-            <w:t>8. 候选航点速度与分层图构建</w:t>
-          </w:r>
+          <w:hyperlink w:anchor="DisclosureSection8" w:history="1">
+            <w:r>
+              <w:t>8. 候选航点速度与分层图构建</w:t>
+            </w:r>
+            <w:r>
+              <w:tab/>
+            </w:r>
+            <w:fldSimple w:instr=" PAGEREF DisclosureSection8 \h ">
+              <w:r>
+                <w:t>12</w:t>
+              </w:r>
+            </w:fldSimple>
+          </w:hyperlink>
         </w:p>
         <w:p>
           <w:pPr>
             <w:pStyle w:val="TOC1"/>
+            <w:tabs>
+              <w:tab w:val="right" w:leader="dot" w:pos="9026"/>
+            </w:tabs>
           </w:pPr>
-          <w:r>
-            <w:t>9. 单轴时间最优转移原理及完整推导</w:t>
-          </w:r>
+          <w:hyperlink w:anchor="DisclosureSection9" w:history="1">
+            <w:r>
+              <w:t>9. 单轴时间最优转移原理及完整推导</w:t>
+            </w:r>
+            <w:r>
+              <w:tab/>
+            </w:r>
+            <w:fldSimple w:instr=" PAGEREF DisclosureSection9 \h ">
+              <w:r>
+                <w:t>14</w:t>
+              </w:r>
+            </w:fldSimple>
+          </w:hyperlink>
         </w:p>
         <w:p>
           <w:pPr>
             <w:pStyle w:val="TOC1"/>
+            <w:tabs>
+              <w:tab w:val="right" w:leader="dot" w:pos="9026"/>
+            </w:tabs>
           </w:pPr>
-          <w:r>
-            <w:t>10. 三轴共同时间重分配与可行性判定</w:t>
-          </w:r>
+          <w:hyperlink w:anchor="DisclosureSection10" w:history="1">
+            <w:r>
+              <w:t>10. 三轴共同时间重分配与可行性判定</w:t>
+            </w:r>
+            <w:r>
+              <w:tab/>
+            </w:r>
+            <w:fldSimple w:instr=" PAGEREF DisclosureSection10 \h ">
+              <w:r>
+                <w:t>17</w:t>
+              </w:r>
+            </w:fldSimple>
+          </w:hyperlink>
         </w:p>
         <w:p>
           <w:pPr>
             <w:pStyle w:val="TOC1"/>
+            <w:tabs>
+              <w:tab w:val="right" w:leader="dot" w:pos="9026"/>
+            </w:tabs>
           </w:pPr>
-          <w:r>
-            <w:t>11. 分层图动态规划与全局最优性证明</w:t>
-          </w:r>
+          <w:hyperlink w:anchor="DisclosureSection11" w:history="1">
+            <w:r>
+              <w:t>11. 分层图动态规划与全局最优性证明</w:t>
+            </w:r>
+            <w:r>
+              <w:tab/>
+            </w:r>
+            <w:fldSimple w:instr=" PAGEREF DisclosureSection11 \h ">
+              <w:r>
+                <w:t>22</w:t>
+              </w:r>
+            </w:fldSimple>
+          </w:hyperlink>
         </w:p>
         <w:p>
           <w:pPr>
             <w:pStyle w:val="TOC1"/>
+            <w:tabs>
+              <w:tab w:val="right" w:leader="dot" w:pos="9026"/>
+            </w:tabs>
           </w:pPr>
-          <w:r>
-            <w:t>12. 轨迹解析重构及连续性说明</w:t>
-          </w:r>
+          <w:hyperlink w:anchor="DisclosureSection12" w:history="1">
+            <w:r>
+              <w:t>12. 轨迹解析重构及连续性说明</w:t>
+            </w:r>
+            <w:r>
+              <w:tab/>
+            </w:r>
+            <w:fldSimple w:instr=" PAGEREF DisclosureSection12 \h ">
+              <w:r>
+                <w:t>25</w:t>
+              </w:r>
+            </w:fldSimple>
+          </w:hyperlink>
         </w:p>
         <w:p>
           <w:pPr>
             <w:pStyle w:val="TOC1"/>
+            <w:tabs>
+              <w:tab w:val="right" w:leader="dot" w:pos="9026"/>
+            </w:tabs>
           </w:pPr>
-          <w:r>
-            <w:t>13. 退化情形、数值容差和异常处理</w:t>
-          </w:r>
+          <w:hyperlink w:anchor="DisclosureSection13" w:history="1">
+            <w:r>
+              <w:t>13. 退化情形、数值容差和异常处理</w:t>
+            </w:r>
+            <w:r>
+              <w:tab/>
+            </w:r>
+            <w:fldSimple w:instr=" PAGEREF DisclosureSection13 \h ">
+              <w:r>
+                <w:t>27</w:t>
+              </w:r>
+            </w:fldSimple>
+          </w:hyperlink>
         </w:p>
         <w:p>
           <w:pPr>
             <w:pStyle w:val="TOC1"/>
+            <w:tabs>
+              <w:tab w:val="right" w:leader="dot" w:pos="9026"/>
+            </w:tabs>
           </w:pPr>
-          <w:r>
-            <w:t>14. 完整算法伪代码</w:t>
-          </w:r>
+          <w:hyperlink w:anchor="DisclosureSection14" w:history="1">
+            <w:r>
+              <w:t>14. 完整算法伪代码</w:t>
+            </w:r>
+            <w:r>
+              <w:tab/>
+            </w:r>
+            <w:fldSimple w:instr=" PAGEREF DisclosureSection14 \h ">
+              <w:r>
+                <w:t>30</w:t>
+              </w:r>
+            </w:fldSimple>
+          </w:hyperlink>
         </w:p>
         <w:p>
           <w:pPr>
             <w:pStyle w:val="TOC1"/>
+            <w:tabs>
+              <w:tab w:val="right" w:leader="dot" w:pos="9026"/>
+            </w:tabs>
           </w:pPr>
-          <w:r>
-            <w:t>15. 具体实施例</w:t>
-          </w:r>
+          <w:hyperlink w:anchor="DisclosureSection15" w:history="1">
+            <w:r>
+              <w:t>15. 具体实施例</w:t>
+            </w:r>
+            <w:r>
+              <w:tab/>
+            </w:r>
+            <w:fldSimple w:instr=" PAGEREF DisclosureSection15 \h ">
+              <w:r>
+                <w:t>34</w:t>
+              </w:r>
+            </w:fldSimple>
+          </w:hyperlink>
         </w:p>
         <w:p>
           <w:pPr>
             <w:pStyle w:val="TOC1"/>
+            <w:tabs>
+              <w:tab w:val="right" w:leader="dot" w:pos="9026"/>
+            </w:tabs>
           </w:pPr>
-          <w:r>
-            <w:t>16. 有益效果</w:t>
-          </w:r>
+          <w:hyperlink w:anchor="DisclosureSection16" w:history="1">
+            <w:r>
+              <w:t>16. 有益效果</w:t>
+            </w:r>
+            <w:r>
+              <w:tab/>
+            </w:r>
+            <w:fldSimple w:instr=" PAGEREF DisclosureSection16 \h ">
+              <w:r>
+                <w:t>35</w:t>
+              </w:r>
+            </w:fldSimple>
+          </w:hyperlink>
         </w:p>
         <w:p>
           <w:pPr>
             <w:pStyle w:val="TOC1"/>
+            <w:tabs>
+              <w:tab w:val="right" w:leader="dot" w:pos="9026"/>
+            </w:tabs>
           </w:pPr>
-          <w:r>
-            <w:t>17. 附图说明</w:t>
-          </w:r>
+          <w:hyperlink w:anchor="DisclosureSection17" w:history="1">
+            <w:r>
+              <w:t>17. 附图说明</w:t>
+            </w:r>
+            <w:r>
+              <w:tab/>
+            </w:r>
+            <w:fldSimple w:instr=" PAGEREF DisclosureSection17 \h ">
+              <w:r>
+                <w:t>36</w:t>
+              </w:r>
+            </w:fldSimple>
+          </w:hyperlink>
         </w:p>
         <w:p>
           <w:pPr>
             <w:pStyle w:val="TOC1"/>
+            <w:tabs>
+              <w:tab w:val="right" w:leader="dot" w:pos="9026"/>
+            </w:tabs>
           </w:pPr>
-          <w:r>
-            <w:t>18. 仿真验证与效果说明（预留）</w:t>
-          </w:r>
+          <w:hyperlink w:anchor="DisclosureSection18" w:history="1">
+            <w:r>
+              <w:t>18. 仿真验证与效果说明（预留）</w:t>
+            </w:r>
+            <w:r>
+              <w:tab/>
+            </w:r>
+            <w:fldSimple w:instr=" PAGEREF DisclosureSection18 \h ">
+              <w:r>
+                <w:t>37</w:t>
+              </w:r>
+            </w:fldSimple>
+          </w:hyperlink>
         </w:p>
         <w:p>
           <w:r>
@@ -195,11 +429,13 @@
       <w:pPr>
         <w:pStyle w:val="Heading2"/>
       </w:pPr>
+      <w:bookmarkStart w:id="47" w:name="DisclosureSection1"/>
       <w:bookmarkStart w:id="21" w:name="发明名称"/>
       <w:r>
         <w:t xml:space="preserve">1. 发明名称</w:t>
       </w:r>
       <w:bookmarkEnd w:id="21"/>
+      <w:bookmarkEnd w:id="47"/>
     </w:p>
     <w:p>
       <w:pPr>
@@ -213,11 +449,13 @@
       <w:pPr>
         <w:pStyle w:val="Heading2"/>
       </w:pPr>
+      <w:bookmarkStart w:id="48" w:name="DisclosureSection2"/>
       <w:bookmarkStart w:id="22" w:name="技术领域"/>
       <w:r>
         <w:t xml:space="preserve">2. 技术领域</w:t>
       </w:r>
       <w:bookmarkEnd w:id="22"/>
+      <w:bookmarkEnd w:id="48"/>
     </w:p>
     <w:p>
       <w:pPr>
@@ -259,11 +497,13 @@
       <w:pPr>
         <w:pStyle w:val="Heading2"/>
       </w:pPr>
+      <w:bookmarkStart w:id="49" w:name="DisclosureSection3"/>
       <w:bookmarkStart w:id="23" w:name="背景技术"/>
       <w:r>
         <w:t xml:space="preserve">3. 背景技术</w:t>
       </w:r>
       <w:bookmarkEnd w:id="23"/>
+      <w:bookmarkEnd w:id="49"/>
     </w:p>
     <w:p>
       <w:pPr>
@@ -325,11 +565,13 @@
       <w:pPr>
         <w:pStyle w:val="Heading2"/>
       </w:pPr>
+      <w:bookmarkStart w:id="50" w:name="DisclosureSection4"/>
       <w:bookmarkStart w:id="24" w:name="现有技术存在的问题"/>
       <w:r>
         <w:t xml:space="preserve">4. 现有技术存在的问题</w:t>
       </w:r>
       <w:bookmarkEnd w:id="24"/>
+      <w:bookmarkEnd w:id="50"/>
     </w:p>
     <w:p>
       <w:pPr>
@@ -383,11 +625,13 @@
       <w:pPr>
         <w:pStyle w:val="Heading2"/>
       </w:pPr>
+      <w:bookmarkStart w:id="51" w:name="DisclosureSection5"/>
       <w:bookmarkStart w:id="25" w:name="发明目的"/>
       <w:r>
         <w:t xml:space="preserve">5. 发明目的</w:t>
       </w:r>
       <w:bookmarkEnd w:id="25"/>
+      <w:bookmarkEnd w:id="51"/>
     </w:p>
     <w:p>
       <w:pPr>
@@ -449,11 +693,13 @@
       <w:pPr>
         <w:pStyle w:val="Heading2"/>
       </w:pPr>
+      <w:bookmarkStart w:id="52" w:name="DisclosureSection6"/>
       <w:bookmarkStart w:id="26" w:name="技术方案总体说明"/>
       <w:r>
         <w:t xml:space="preserve">6. 技术方案总体说明</w:t>
       </w:r>
       <w:bookmarkEnd w:id="26"/>
+      <w:bookmarkEnd w:id="52"/>
     </w:p>
     <w:p>
       <w:pPr>
@@ -567,11 +813,13 @@
       <w:pPr>
         <w:pStyle w:val="Heading2"/>
       </w:pPr>
+      <w:bookmarkStart w:id="53" w:name="DisclosureSection7"/>
       <w:bookmarkStart w:id="27" w:name="数学模型与适用条件"/>
       <w:r>
         <w:t xml:space="preserve">7. 数学模型与适用条件</w:t>
       </w:r>
       <w:bookmarkEnd w:id="27"/>
+      <w:bookmarkEnd w:id="53"/>
     </w:p>
     <w:p>
       <w:pPr>
@@ -1602,29 +1850,9 @@
       <w:r>
         <w:t xml:space="preserve">第三个层次是单航段同步控制族内最优。本文把每轴同步控制限定为：选择一种上下界顺序，并以同一</w:t>
       </w:r>
-      <ns1:oMath>
-        <ns1:r>
-          <ns1:t>α</ns1:t>
-        </ns1:r>
-        <ns1:r>
-          <ns1:t>∈</ns1:t>
-        </ns1:r>
-        <ns1:r>
-          <ns1:t>[</ns1:t>
-        </ns1:r>
-        <ns1:r>
-          <ns1:t>0</ns1:t>
-        </ns1:r>
-        <ns1:r>
-          <ns1:t>,</ns1:t>
-        </ns1:r>
-        <ns1:r>
-          <ns1:t>1</ns1:t>
-        </ns1:r>
-        <ns1:r>
-          <ns1:t>]</ns1:t>
-        </ns1:r>
-      </ns1:oMath>
+      <w:r>
+        <w:t>α∈[0,1]</w:t>
+      </w:r>
       <w:r>
         <w:t xml:space="preserve">缩放两个名义边界，在共同总时间</w:t>
       </w:r>
@@ -1773,11 +2001,13 @@
       <w:pPr>
         <w:pStyle w:val="Heading2"/>
       </w:pPr>
+      <w:bookmarkStart w:id="54" w:name="DisclosureSection8"/>
       <w:bookmarkStart w:id="29" w:name="候选航点速度与分层图构建"/>
       <w:r>
         <w:t xml:space="preserve">8. 候选航点速度与分层图构建</w:t>
       </w:r>
       <w:bookmarkEnd w:id="29"/>
+      <w:bookmarkEnd w:id="54"/>
     </w:p>
     <w:p>
       <w:pPr>
@@ -2740,11 +2970,13 @@
       <w:pPr>
         <w:pStyle w:val="Heading2"/>
       </w:pPr>
+      <w:bookmarkStart w:id="55" w:name="DisclosureSection9"/>
       <w:bookmarkStart w:id="30" w:name="单轴时间最优转移原理及完整推导"/>
       <w:r>
         <w:t xml:space="preserve">9. 单轴时间最优转移原理及完整推导</w:t>
       </w:r>
       <w:bookmarkEnd w:id="30"/>
+      <w:bookmarkEnd w:id="55"/>
     </w:p>
     <w:p>
       <w:pPr>
@@ -2877,20 +3109,17 @@
       <w:r>
         <w:t xml:space="preserve">。在第一阶段</w:t>
       </w:r>
-      <ns1:oMath>
-        <ns1:r>
-          <ns1:t>[</ns1:t>
-        </ns1:r>
-        <ns1:r>
-          <ns1:t>0</ns1:t>
-        </ns1:r>
-        <ns1:r>
-          <ns1:t>,</ns1:t>
-        </ns1:r>
-        <ns1:sSub>
-          <ns1:e>
-            <ns1:r>
-              <ns1:t>t</ns1:t>
+      <w:r>
+        <w:t>[0,t_1]</w:t>
+      </w:r>
+      <w:r>
+        <w:t xml:space="preserve">采用加速度</w:t>
+      </w:r>
+      <ns1:oMath>
+        <ns1:sSub>
+          <ns1:e>
+            <ns1:r>
+              <ns1:t>a</ns1:t>
             </ns1:r>
           </ns1:e>
           <ns1:sub>
@@ -2899,80 +3128,13 @@
             </ns1:r>
           </ns1:sub>
         </ns1:sSub>
-        <ns1:r>
-          <ns1:t>]</ns1:t>
-        </ns1:r>
-      </ns1:oMath>
-      <w:r>
-        <w:t xml:space="preserve">采用加速度</w:t>
-      </w:r>
-      <ns1:oMath>
-        <ns1:sSub>
-          <ns1:e>
-            <ns1:r>
-              <ns1:t>a</ns1:t>
-            </ns1:r>
-          </ns1:e>
-          <ns1:sub>
-            <ns1:r>
-              <ns1:t>1</ns1:t>
-            </ns1:r>
-          </ns1:sub>
-        </ns1:sSub>
       </ns1:oMath>
       <w:r>
         <w:t xml:space="preserve">，在第二阶段</w:t>
       </w:r>
-      <ns1:oMath>
-        <ns1:r>
-          <ns1:t>[</ns1:t>
-        </ns1:r>
-        <ns1:sSub>
-          <ns1:e>
-            <ns1:r>
-              <ns1:t>t</ns1:t>
-            </ns1:r>
-          </ns1:e>
-          <ns1:sub>
-            <ns1:r>
-              <ns1:t>1</ns1:t>
-            </ns1:r>
-          </ns1:sub>
-        </ns1:sSub>
-        <ns1:r>
-          <ns1:t>,</ns1:t>
-        </ns1:r>
-        <ns1:sSub>
-          <ns1:e>
-            <ns1:r>
-              <ns1:t>t</ns1:t>
-            </ns1:r>
-          </ns1:e>
-          <ns1:sub>
-            <ns1:r>
-              <ns1:t>1</ns1:t>
-            </ns1:r>
-          </ns1:sub>
-        </ns1:sSub>
-        <ns1:r>
-          <ns1:t>+</ns1:t>
-        </ns1:r>
-        <ns1:sSub>
-          <ns1:e>
-            <ns1:r>
-              <ns1:t>t</ns1:t>
-            </ns1:r>
-          </ns1:e>
-          <ns1:sub>
-            <ns1:r>
-              <ns1:t>2</ns1:t>
-            </ns1:r>
-          </ns1:sub>
-        </ns1:sSub>
-        <ns1:r>
-          <ns1:t>]</ns1:t>
-        </ns1:r>
-      </ns1:oMath>
+      <w:r>
+        <w:t>[t_1,t_1+t_2]</w:t>
+      </w:r>
       <w:r>
         <w:t xml:space="preserve">采用加速度</w:t>
       </w:r>
@@ -3645,64 +3807,15 @@
       <w:r>
         <w:t xml:space="preserve">处于</w:t>
       </w:r>
-      <ns1:oMath>
-        <ns1:r>
-          <ns1:t>[</ns1:t>
-        </ns1:r>
-        <ns1:r>
-          <ns1:t>−</ns1:t>
-        </ns1:r>
-        <ns1:sSub>
-          <ns1:e>
-            <ns1:r>
-              <ns1:t>ε</ns1:t>
-            </ns1:r>
-          </ns1:e>
-          <ns1:sub>
-            <ns1:r>
-              <ns1:t>Δ</ns1:t>
-            </ns1:r>
-          </ns1:sub>
-        </ns1:sSub>
-        <ns1:r>
-          <ns1:t>,</ns1:t>
-        </ns1:r>
-        <ns1:r>
-          <ns1:t>0</ns1:t>
-        </ns1:r>
-        <ns1:r>
-          <ns1:t>)</ns1:t>
-        </ns1:r>
-      </ns1:oMath>
+      <w:r>
+        <w:t>[−ε_Δ,0)</w:t>
+      </w:r>
       <w:r>
         <w:t xml:space="preserve">时将其截断为零。当</w:t>
       </w:r>
-      <ns1:oMath>
-        <ns1:r>
-          <ns1:t>|</ns1:t>
-        </ns1:r>
-        <ns1:r>
-          <ns1:t>A</ns1:t>
-        </ns1:r>
-        <ns1:r>
-          <ns1:t>|</ns1:t>
-        </ns1:r>
-        <ns1:r>
-          <ns1:t>&gt;</ns1:t>
-        </ns1:r>
-        <ns1:sSub>
-          <ns1:e>
-            <ns1:r>
-              <ns1:t>ε</ns1:t>
-            </ns1:r>
-          </ns1:e>
-          <ns1:sub>
-            <ns1:r>
-              <ns1:t>A</ns1:t>
-            </ns1:r>
-          </ns1:sub>
-        </ns1:sSub>
-      </ns1:oMath>
+      <w:r>
+        <w:t>|A|&gt;ε_A</w:t>
+      </w:r>
       <w:r>
         <w:t xml:space="preserve">时，两根为</w:t>
       </w:r>
@@ -3847,121 +3960,59 @@
       <w:r>
         <w:t xml:space="preserve">当</w:t>
       </w:r>
-      <ns1:oMath>
-        <ns1:r>
-          <ns1:t>|</ns1:t>
-        </ns1:r>
-        <ns1:r>
-          <ns1:t>A</ns1:t>
-        </ns1:r>
-        <ns1:r>
-          <ns1:t>|</ns1:t>
-        </ns1:r>
-        <ns1:r>
-          <ns1:t>≤</ns1:t>
-        </ns1:r>
-        <ns1:sSub>
-          <ns1:e>
-            <ns1:r>
-              <ns1:t>ε</ns1:t>
-            </ns1:r>
-          </ns1:e>
-          <ns1:sub>
-            <ns1:r>
-              <ns1:t>A</ns1:t>
-            </ns1:r>
-          </ns1:sub>
-        </ns1:sSub>
-      </ns1:oMath>
+      <w:r>
+        <w:t>|A|≤ε_A</w:t>
+      </w:r>
       <w:r>
         <w:t xml:space="preserve">且</w:t>
       </w:r>
-      <ns1:oMath>
-        <ns1:r>
-          <ns1:t>|</ns1:t>
+      <w:r>
+        <w:t>|B|&gt;ε_B</w:t>
+      </w:r>
+      <w:r>
+        <w:t xml:space="preserve">时，使用一次方程根</w:t>
+      </w:r>
+      <ns1:oMath>
+        <ns1:sSub>
+          <ns1:e>
+            <ns1:r>
+              <ns1:t>t</ns1:t>
+            </ns1:r>
+          </ns1:e>
+          <ns1:sub>
+            <ns1:r>
+              <ns1:t>1</ns1:t>
+            </ns1:r>
+          </ns1:sub>
+        </ns1:sSub>
+        <ns1:r>
+          <ns1:t>=</ns1:t>
+        </ns1:r>
+        <ns1:r>
+          <ns1:t>−</ns1:t>
+        </ns1:r>
+        <ns1:r>
+          <ns1:t>C</ns1:t>
+        </ns1:r>
+        <ns1:r>
+          <ns1:t>/</ns1:t>
         </ns1:r>
         <ns1:r>
           <ns1:t>B</ns1:t>
         </ns1:r>
-        <ns1:r>
-          <ns1:t>|</ns1:t>
-        </ns1:r>
-        <ns1:r>
-          <ns1:t>&gt;</ns1:t>
-        </ns1:r>
-        <ns1:sSub>
-          <ns1:e>
-            <ns1:r>
-              <ns1:t>ε</ns1:t>
-            </ns1:r>
-          </ns1:e>
-          <ns1:sub>
-            <ns1:r>
-              <ns1:t>B</ns1:t>
-            </ns1:r>
-          </ns1:sub>
-        </ns1:sSub>
-      </ns1:oMath>
-      <w:r>
-        <w:t xml:space="preserve">时，使用一次方程根</w:t>
-      </w:r>
-      <ns1:oMath>
-        <ns1:sSub>
-          <ns1:e>
-            <ns1:r>
-              <ns1:t>t</ns1:t>
-            </ns1:r>
-          </ns1:e>
-          <ns1:sub>
-            <ns1:r>
-              <ns1:t>1</ns1:t>
-            </ns1:r>
-          </ns1:sub>
-        </ns1:sSub>
-        <ns1:r>
-          <ns1:t>=</ns1:t>
-        </ns1:r>
-        <ns1:r>
-          <ns1:t>−</ns1:t>
-        </ns1:r>
-        <ns1:r>
-          <ns1:t>C</ns1:t>
-        </ns1:r>
-        <ns1:r>
-          <ns1:t>/</ns1:t>
-        </ns1:r>
-        <ns1:r>
-          <ns1:t>B</ns1:t>
-        </ns1:r>
       </ns1:oMath>
       <w:r>
         <w:t xml:space="preserve">。当</w:t>
       </w:r>
-      <ns1:oMath>
-        <ns1:r>
-          <ns1:t>|</ns1:t>
-        </ns1:r>
-        <ns1:r>
-          <ns1:t>A</ns1:t>
-        </ns1:r>
-        <ns1:r>
-          <ns1:t>|</ns1:t>
-        </ns1:r>
-      </ns1:oMath>
+      <w:r>
+        <w:t>|A|</w:t>
+      </w:r>
       <w:r>
         <w:t xml:space="preserve">和</w:t>
       </w:r>
-      <ns1:oMath>
-        <ns1:r>
-          <ns1:t>|</ns1:t>
-        </ns1:r>
-        <ns1:r>
-          <ns1:t>B</ns1:t>
-        </ns1:r>
-        <ns1:r>
-          <ns1:t>|</ns1:t>
-        </ns1:r>
-      </ns1:oMath>
+      <w:r>
+        <w:t>|B|</w:t>
+      </w:r>
       <w:r>
         <w:t xml:space="preserve">均小于容差时，需要检查</w:t>
       </w:r>
@@ -4616,11 +4667,13 @@
       <w:pPr>
         <w:pStyle w:val="Heading2"/>
       </w:pPr>
+      <w:bookmarkStart w:id="56" w:name="DisclosureSection10"/>
       <w:bookmarkStart w:id="33" w:name="三轴共同时间重分配与可行性判定"/>
       <w:r>
         <w:t xml:space="preserve">10. 三轴共同时间重分配与可行性判定</w:t>
       </w:r>
       <w:bookmarkEnd w:id="33"/>
+      <w:bookmarkEnd w:id="56"/>
     </w:p>
     <w:p>
       <w:pPr>
@@ -4855,81 +4908,21 @@
       <w:r>
         <w:t xml:space="preserve">。共同缩放系数取</w:t>
       </w:r>
-      <ns1:oMath>
-        <ns1:r>
-          <ns1:t>[</ns1:t>
-        </ns1:r>
-        <ns1:r>
-          <ns1:t>0</ns1:t>
-        </ns1:r>
-        <ns1:r>
-          <ns1:t>,</ns1:t>
-        </ns1:r>
-        <ns1:r>
-          <ns1:t>1</ns1:t>
-        </ns1:r>
-        <ns1:r>
-          <ns1:t>]</ns1:t>
-        </ns1:r>
-      </ns1:oMath>
+      <w:r>
+        <w:t>[0,1]</w:t>
+      </w:r>
       <w:r>
         <w:t xml:space="preserve">而不是</w:t>
       </w:r>
-      <ns1:oMath>
-        <ns1:r>
-          <ns1:t>[</ns1:t>
-        </ns1:r>
-        <ns1:r>
-          <ns1:t>−</ns1:t>
-        </ns1:r>
-        <ns1:r>
-          <ns1:t>1</ns1:t>
-        </ns1:r>
-        <ns1:r>
-          <ns1:t>,</ns1:t>
-        </ns1:r>
-        <ns1:r>
-          <ns1:t>1</ns1:t>
-        </ns1:r>
-        <ns1:r>
-          <ns1:t>]</ns1:t>
-        </ns1:r>
-      </ns1:oMath>
+      <w:r>
+        <w:t>[−1,1]</w:t>
+      </w:r>
       <w:r>
         <w:t xml:space="preserve">，因为正、负切换顺序已经分别枚举；负缩放会反转两个名义加速度的方向并重复或破坏既定顺序。在加速度区间包含零时，</w:t>
       </w:r>
-      <ns1:oMath>
-        <ns1:sSub>
-          <ns1:e>
-            <ns1:r>
-              <ns1:t>α</ns1:t>
-            </ns1:r>
-          </ns1:e>
-          <ns1:sub>
-            <ns1:r>
-              <ns1:t>r</ns1:t>
-            </ns1:r>
-          </ns1:sub>
-        </ns1:sSub>
-        <ns1:r>
-          <ns1:t>∈</ns1:t>
-        </ns1:r>
-        <ns1:r>
-          <ns1:t>[</ns1:t>
-        </ns1:r>
-        <ns1:r>
-          <ns1:t>0</ns1:t>
-        </ns1:r>
-        <ns1:r>
-          <ns1:t>,</ns1:t>
-        </ns1:r>
-        <ns1:r>
-          <ns1:t>1</ns1:t>
-        </ns1:r>
-        <ns1:r>
-          <ns1:t>]</ns1:t>
-        </ns1:r>
-      </ns1:oMath>
+      <w:r>
+        <w:t>α_r∈[0,1]</w:t>
+      </w:r>
       <w:r>
         <w:t xml:space="preserve">还直接保证两个实际加速度不越界。</w:t>
       </w:r>
@@ -5224,53 +5217,68 @@
       <w:r>
         <w:t xml:space="preserve">，但允许用同一系数</w:t>
       </w:r>
-      <ns1:oMath>
+      <w:r>
+        <w:t>α∈[0,1]</w:t>
+      </w:r>
+      <w:r>
+        <w:t xml:space="preserve">缩放两个阶段。令第一阶段时长为</w:t>
+      </w:r>
+      <ns1:oMath>
+        <ns1:r>
+          <ns1:t>τ</ns1:t>
+        </ns1:r>
+      </ns1:oMath>
+      <w:r>
+        <w:t xml:space="preserve">，第二阶段时长为</w:t>
+      </w:r>
+      <ns1:oMath>
+        <ns1:r>
+          <ns1:t>T</ns1:t>
+        </ns1:r>
+        <ns1:r>
+          <ns1:t>−</ns1:t>
+        </ns1:r>
+        <ns1:r>
+          <ns1:t>τ</ns1:t>
+        </ns1:r>
+      </ns1:oMath>
+      <w:r>
+        <w:t xml:space="preserve">，实际加速度为</w:t>
+      </w:r>
+      <ns1:oMath>
+        <ns1:sSub>
+          <ns1:e>
+            <ns1:r>
+              <ns1:t>u</ns1:t>
+            </ns1:r>
+          </ns1:e>
+          <ns1:sub>
+            <ns1:r>
+              <ns1:t>1</ns1:t>
+            </ns1:r>
+          </ns1:sub>
+        </ns1:sSub>
+        <ns1:r>
+          <ns1:t>=</ns1:t>
+        </ns1:r>
         <ns1:r>
           <ns1:t>α</ns1:t>
         </ns1:r>
-        <ns1:r>
-          <ns1:t>∈</ns1:t>
-        </ns1:r>
-        <ns1:r>
-          <ns1:t>[</ns1:t>
-        </ns1:r>
-        <ns1:r>
-          <ns1:t>0</ns1:t>
-        </ns1:r>
-        <ns1:r>
-          <ns1:t>,</ns1:t>
-        </ns1:r>
-        <ns1:r>
-          <ns1:t>1</ns1:t>
-        </ns1:r>
-        <ns1:r>
-          <ns1:t>]</ns1:t>
-        </ns1:r>
-      </ns1:oMath>
-      <w:r>
-        <w:t xml:space="preserve">缩放两个阶段。令第一阶段时长为</w:t>
-      </w:r>
-      <ns1:oMath>
-        <ns1:r>
-          <ns1:t>τ</ns1:t>
-        </ns1:r>
-      </ns1:oMath>
-      <w:r>
-        <w:t xml:space="preserve">，第二阶段时长为</w:t>
-      </w:r>
-      <ns1:oMath>
-        <ns1:r>
-          <ns1:t>T</ns1:t>
-        </ns1:r>
-        <ns1:r>
-          <ns1:t>−</ns1:t>
-        </ns1:r>
-        <ns1:r>
-          <ns1:t>τ</ns1:t>
-        </ns1:r>
-      </ns1:oMath>
-      <w:r>
-        <w:t xml:space="preserve">，实际加速度为</w:t>
+        <ns1:sSub>
+          <ns1:e>
+            <ns1:r>
+              <ns1:t>b</ns1:t>
+            </ns1:r>
+          </ns1:e>
+          <ns1:sub>
+            <ns1:r>
+              <ns1:t>1</ns1:t>
+            </ns1:r>
+          </ns1:sub>
+        </ns1:sSub>
+      </ns1:oMath>
+      <w:r>
+        <w:t xml:space="preserve">和</w:t>
       </w:r>
       <ns1:oMath>
         <ns1:sSub>
@@ -5281,7 +5289,7 @@
           </ns1:e>
           <ns1:sub>
             <ns1:r>
-              <ns1:t>1</ns1:t>
+              <ns1:t>2</ns1:t>
             </ns1:r>
           </ns1:sub>
         </ns1:sSub>
@@ -5299,45 +5307,10 @@
           </ns1:e>
           <ns1:sub>
             <ns1:r>
-              <ns1:t>1</ns1:t>
-            </ns1:r>
-          </ns1:sub>
-        </ns1:sSub>
-      </ns1:oMath>
-      <w:r>
-        <w:t xml:space="preserve">和</w:t>
-      </w:r>
-      <ns1:oMath>
-        <ns1:sSub>
-          <ns1:e>
-            <ns1:r>
-              <ns1:t>u</ns1:t>
-            </ns1:r>
-          </ns1:e>
-          <ns1:sub>
-            <ns1:r>
               <ns1:t>2</ns1:t>
             </ns1:r>
           </ns1:sub>
         </ns1:sSub>
-        <ns1:r>
-          <ns1:t>=</ns1:t>
-        </ns1:r>
-        <ns1:r>
-          <ns1:t>α</ns1:t>
-        </ns1:r>
-        <ns1:sSub>
-          <ns1:e>
-            <ns1:r>
-              <ns1:t>b</ns1:t>
-            </ns1:r>
-          </ns1:e>
-          <ns1:sub>
-            <ns1:r>
-              <ns1:t>2</ns1:t>
-            </ns1:r>
-          </ns1:sub>
-        </ns1:sSub>
       </ns1:oMath>
       <w:r>
         <w:t xml:space="preserve">。固定时间端点约束为</w:t>
@@ -5346,104 +5319,11 @@
     <w:p>
       <w:pPr>
         <w:pStyle w:val="BodyText"/>
-      </w:pPr>
-      <ns1:oMathPara>
-        <ns1:oMathParaPr>
-          <ns1:jc ns1:val="center"/>
-        </ns1:oMathParaPr>
-        <ns1:oMath>
-          <ns1:sSub>
-            <ns1:e>
-              <ns1:r>
-                <ns1:t>v</ns1:t>
-              </ns1:r>
-            </ns1:e>
-            <ns1:sub>
-              <ns1:r>
-                <ns1:t>f</ns1:t>
-              </ns1:r>
-            </ns1:sub>
-          </ns1:sSub>
-          <ns1:r>
-            <ns1:t>−</ns1:t>
-          </ns1:r>
-          <ns1:sSub>
-            <ns1:e>
-              <ns1:r>
-                <ns1:t>v</ns1:t>
-              </ns1:r>
-            </ns1:e>
-            <ns1:sub>
-              <ns1:r>
-                <ns1:t>0</ns1:t>
-              </ns1:r>
-            </ns1:sub>
-          </ns1:sSub>
-          <ns1:r>
-            <ns1:t>=</ns1:t>
-          </ns1:r>
-          <ns1:r>
-            <ns1:t>α</ns1:t>
-          </ns1:r>
-          <ns1:r>
-            <ns1:t> </ns1:t>
-          </ns1:r>
-          <ns1:r>
-            <ns1:t>[</ns1:t>
-          </ns1:r>
-          <ns1:sSub>
-            <ns1:e>
-              <ns1:r>
-                <ns1:t>b</ns1:t>
-              </ns1:r>
-            </ns1:e>
-            <ns1:sub>
-              <ns1:r>
-                <ns1:t>1</ns1:t>
-              </ns1:r>
-            </ns1:sub>
-          </ns1:sSub>
-          <ns1:r>
-            <ns1:t>τ</ns1:t>
-          </ns1:r>
-          <ns1:r>
-            <ns1:t>+</ns1:t>
-          </ns1:r>
-          <ns1:sSub>
-            <ns1:e>
-              <ns1:r>
-                <ns1:t>b</ns1:t>
-              </ns1:r>
-            </ns1:e>
-            <ns1:sub>
-              <ns1:r>
-                <ns1:t>2</ns1:t>
-              </ns1:r>
-            </ns1:sub>
-          </ns1:sSub>
-          <ns1:r>
-            <ns1:t>(</ns1:t>
-          </ns1:r>
-          <ns1:r>
-            <ns1:t>T</ns1:t>
-          </ns1:r>
-          <ns1:r>
-            <ns1:t>−</ns1:t>
-          </ns1:r>
-          <ns1:r>
-            <ns1:t>τ</ns1:t>
-          </ns1:r>
-          <ns1:r>
-            <ns1:t>)</ns1:t>
-          </ns1:r>
-          <ns1:r>
-            <ns1:t>]</ns1:t>
-          </ns1:r>
-          <ns1:r>
-            <ns1:t>，</ns1:t>
-          </ns1:r>
-        </ns1:oMath>
-      </ns1:oMathPara>
+        <w:jc w:val="center"/>
+      </w:pPr>
+      <w:r>
+        <w:t>v_f−v_0=α [b_1τ+b_2(T−τ)]，</w:t>
+      </w:r>
     </w:p>
     <w:p>
       <w:pPr>
@@ -6058,29 +5938,9 @@
       <w:r>
         <w:t xml:space="preserve">本身是包含零的区间端点，</w:t>
       </w:r>
-      <ns1:oMath>
-        <ns1:r>
-          <ns1:t>α</ns1:t>
-        </ns1:r>
-        <ns1:r>
-          <ns1:t>∈</ns1:t>
-        </ns1:r>
-        <ns1:r>
-          <ns1:t>[</ns1:t>
-        </ns1:r>
-        <ns1:r>
-          <ns1:t>0</ns1:t>
-        </ns1:r>
-        <ns1:r>
-          <ns1:t>,</ns1:t>
-        </ns1:r>
-        <ns1:r>
-          <ns1:t>1</ns1:t>
-        </ns1:r>
-        <ns1:r>
-          <ns1:t>]</ns1:t>
-        </ns1:r>
-      </ns1:oMath>
+      <w:r>
+        <w:t>α∈[0,1]</w:t>
+      </w:r>
       <w:r>
         <w:t xml:space="preserve">通常已经蕴含实际加速度界；仍显式检查该界可以防止参数错误和数值越界。</w:t>
       </w:r>
@@ -6559,10 +6419,139 @@
       <w:r>
         <w:t xml:space="preserve">轴，由此得到可行时间区间及其全部下边界，再从小到大验证；该投影会同时处理变量边界、重根判别式和雅可比退化等可能形成投影边界的情形。另一种数值实现是在已取得某个可行上界后，对闭区间</w:t>
       </w:r>
-      <ns1:oMath>
-        <ns1:r>
-          <ns1:t>[</ns1:t>
-        </ns1:r>
+      <w:r>
+        <w:t>[T_lb,T_ub]</w:t>
+      </w:r>
+      <w:r>
+        <w:t xml:space="preserve">采用带区间算术证明的分支定界：只删除已被证明不可行或其下界不优于当前可行值的区间，直至达到规定时间容差。这两种方式均检查全部顺序和根，不假设可行性关于</w:t>
+      </w:r>
+      <ns1:oMath>
+        <ns1:r>
+          <ns1:t>T</ns1:t>
+        </ns1:r>
+      </ns1:oMath>
+      <w:r>
+        <w:t xml:space="preserve">单调，因而不能替换为未经单调性证明的普通二分搜索。</w:t>
+      </w:r>
+    </w:p>
+    <w:p>
+      <w:pPr>
+        <w:pStyle w:val="BodyText"/>
+      </w:pPr>
+      <w:r>
+        <w:t xml:space="preserve">若共同可行集合非空，则上述最小值能够取得，而不只是不可达的下确界。任取一个共同可行时间</w:t>
+      </w:r>
+      <ns1:oMath>
+        <ns1:sSub>
+          <ns1:e>
+            <ns1:r>
+              <ns1:t>T</ns1:t>
+            </ns1:r>
+          </ns1:e>
+          <ns1:sub>
+            <ns1:r>
+              <ns1:rPr>
+                <ns1:sty ns1:val="p"/>
+              </ns1:rPr>
+              <ns1:t>u</ns1:t>
+            </ns1:r>
+            <ns1:r>
+              <ns1:rPr>
+                <ns1:sty ns1:val="p"/>
+              </ns1:rPr>
+              <ns1:t>b</ns1:t>
+            </ns1:r>
+          </ns1:sub>
+        </ns1:sSub>
+      </ns1:oMath>
+      <w:r>
+        <w:t xml:space="preserve">，把搜索限制在</w:t>
+      </w:r>
+      <w:r>
+        <w:t>[0,T_ub]</w:t>
+      </w:r>
+      <w:r>
+        <w:t xml:space="preserve">。对每个轴均有</w:t>
+      </w:r>
+      <ns1:oMath>
+        <ns1:r>
+          <ns1:t>0</ns1:t>
+        </ns1:r>
+        <ns1:r>
+          <ns1:t>≤</ns1:t>
+        </ns1:r>
+        <ns1:sSub>
+          <ns1:e>
+            <ns1:r>
+              <ns1:t>τ</ns1:t>
+            </ns1:r>
+          </ns1:e>
+          <ns1:sub>
+            <ns1:r>
+              <ns1:t>r</ns1:t>
+            </ns1:r>
+          </ns1:sub>
+        </ns1:sSub>
+        <ns1:r>
+          <ns1:t>≤</ns1:t>
+        </ns1:r>
+        <ns1:r>
+          <ns1:t>T</ns1:t>
+        </ns1:r>
+      </ns1:oMath>
+      <w:r>
+        <w:t xml:space="preserve">和</w:t>
+      </w:r>
+      <ns1:oMath>
+        <ns1:r>
+          <ns1:t>0</ns1:t>
+        </ns1:r>
+        <ns1:r>
+          <ns1:t>≤</ns1:t>
+        </ns1:r>
+        <ns1:sSub>
+          <ns1:e>
+            <ns1:r>
+              <ns1:t>α</ns1:t>
+            </ns1:r>
+          </ns1:e>
+          <ns1:sub>
+            <ns1:r>
+              <ns1:t>r</ns1:t>
+            </ns1:r>
+          </ns1:sub>
+        </ns1:sSub>
+        <ns1:r>
+          <ns1:t>≤</ns1:t>
+        </ns1:r>
+        <ns1:r>
+          <ns1:t>1</ns1:t>
+        </ns1:r>
+      </ns1:oMath>
+      <w:r>
+        <w:t xml:space="preserve">，所以全部变量处于有界闭集；端点等式及加速度不等式的可行集合为闭集，因而在该紧集上的投影也是紧集。非空共同可行时间投影因此包含自身的最小元素。</w:t>
+      </w:r>
+    </w:p>
+    <w:p>
+      <w:pPr>
+        <w:pStyle w:val="BodyText"/>
+      </w:pPr>
+      <w:r>
+        <w:t xml:space="preserve">当两个或三个轴的独立最短时间相等时，无须用严格大于比较选出唯一</w:t>
+      </w:r>
+      <w:r>
+        <w:t xml:space="preserve">“</w:t>
+      </w:r>
+      <w:r>
+        <w:t xml:space="preserve">主导轴</w:t>
+      </w:r>
+      <w:r>
+        <w:t xml:space="preserve">”</w:t>
+      </w:r>
+      <w:r>
+        <w:t xml:space="preserve">。只需把</w:t>
+      </w:r>
+      <ns1:oMath>
         <ns1:sSub>
           <ns1:e>
             <ns1:r>
@@ -6584,510 +6573,299 @@
             </ns1:r>
           </ns1:sub>
         </ns1:sSub>
-        <ns1:r>
-          <ns1:t>,</ns1:t>
-        </ns1:r>
-        <ns1:sSub>
-          <ns1:e>
-            <ns1:r>
-              <ns1:t>T</ns1:t>
-            </ns1:r>
-          </ns1:e>
-          <ns1:sub>
-            <ns1:r>
-              <ns1:rPr>
-                <ns1:sty ns1:val="p"/>
-              </ns1:rPr>
-              <ns1:t>u</ns1:t>
-            </ns1:r>
-            <ns1:r>
-              <ns1:rPr>
-                <ns1:sty ns1:val="p"/>
-              </ns1:rPr>
+      </ns1:oMath>
+      <w:r>
+        <w:t xml:space="preserve">作为共同可行性测试起点，并对每个轴独立保存该时刻的可行参数。若并列轴均采用其饱和最短时间解，则各自</w:t>
+      </w:r>
+      <ns1:oMath>
+        <ns1:r>
+          <ns1:t>α</ns1:t>
+        </ns1:r>
+        <ns1:r>
+          <ns1:t>=</ns1:t>
+        </ns1:r>
+        <ns1:r>
+          <ns1:t>1</ns1:t>
+        </ns1:r>
+      </ns1:oMath>
+      <w:r>
+        <w:t xml:space="preserve">；若某轴还存在另一组同时间可行参数，任选经完整验证且按确定规则排序的参数即可。由集合定义处理并列情形，不会出现因严格比较而没有坐标轴被赋值的问题。</w:t>
+      </w:r>
+    </w:p>
+    <w:p>
+      <w:pPr>
+        <w:pStyle w:val="Heading3"/>
+      </w:pPr>
+      <w:bookmarkStart w:id="34" w:name="固定时间消元的充分性与退化分支"/>
+      <w:r>
+        <w:t xml:space="preserve">10.1 固定时间消元的充分性与退化分支</w:t>
+      </w:r>
+      <w:bookmarkEnd w:id="34"/>
+    </w:p>
+    <w:p>
+      <w:pPr>
+        <w:pStyle w:val="FirstParagraph"/>
+      </w:pPr>
+      <w:r>
+        <w:t xml:space="preserve">固定时间消元多项式是两个端点方程的必要结果。它将缩放量消去，便于一次列出候选切换时刻，但仅满足该多项式还不足以判定轨迹可行：当消元中可能作为分母的量为零时，多项式可能丢失对缩放量的限制；当求得缩放量超出允许区间时，多项式依然可能等于零。因此，每个候选都必须回到两个原始端点方程，并同时验证时间区间、非负缩放量与实际加速度。</w:t>
+      </w:r>
+    </w:p>
+    <w:p>
+      <w:pPr>
+        <w:pStyle w:val="BodyText"/>
+      </w:pPr>
+      <w:r>
+        <w:t xml:space="preserve">固定时间方程的系数可通过把</w:t>
+      </w:r>
+      <ns1:oMath>
+        <ns1:r>
+          <ns1:t>L</ns1:t>
+        </ns1:r>
+      </ns1:oMath>
+      <w:r>
+        <w:t xml:space="preserve">展开成关于切换时刻的一次式、把</w:t>
+      </w:r>
+      <ns1:oMath>
+        <ns1:r>
+          <ns1:t>Q</ns1:t>
+        </ns1:r>
+      </ns1:oMath>
+      <w:r>
+        <w:t xml:space="preserve">展开成二次式得到。具体而言，</w:t>
+      </w:r>
+      <ns1:oMath>
+        <ns1:r>
+          <ns1:t>L</ns1:t>
+        </ns1:r>
+      </ns1:oMath>
+      <w:r>
+        <w:t xml:space="preserve">的常数项为</w:t>
+      </w:r>
+      <ns1:oMath>
+        <ns1:sSub>
+          <ns1:e>
+            <ns1:r>
               <ns1:t>b</ns1:t>
             </ns1:r>
-          </ns1:sub>
-        </ns1:sSub>
-        <ns1:r>
-          <ns1:t>]</ns1:t>
-        </ns1:r>
-      </ns1:oMath>
-      <w:r>
-        <w:t xml:space="preserve">采用带区间算术证明的分支定界：只删除已被证明不可行或其下界不优于当前可行值的区间，直至达到规定时间容差。这两种方式均检查全部顺序和根，不假设可行性关于</w:t>
-      </w:r>
-      <ns1:oMath>
+          </ns1:e>
+          <ns1:sub>
+            <ns1:r>
+              <ns1:t>2</ns1:t>
+            </ns1:r>
+          </ns1:sub>
+        </ns1:sSub>
         <ns1:r>
           <ns1:t>T</ns1:t>
         </ns1:r>
       </ns1:oMath>
       <w:r>
-        <w:t xml:space="preserve">单调，因而不能替换为未经单调性证明的普通二分搜索。</w:t>
-      </w:r>
-    </w:p>
-    <w:p>
-      <w:pPr>
-        <w:pStyle w:val="BodyText"/>
-      </w:pPr>
-      <w:r>
-        <w:t xml:space="preserve">若共同可行集合非空，则上述最小值能够取得，而不只是不可达的下确界。任取一个共同可行时间</w:t>
-      </w:r>
-      <ns1:oMath>
-        <ns1:sSub>
-          <ns1:e>
-            <ns1:r>
-              <ns1:t>T</ns1:t>
-            </ns1:r>
-          </ns1:e>
-          <ns1:sub>
-            <ns1:r>
-              <ns1:rPr>
-                <ns1:sty ns1:val="p"/>
-              </ns1:rPr>
-              <ns1:t>u</ns1:t>
-            </ns1:r>
-            <ns1:r>
-              <ns1:rPr>
-                <ns1:sty ns1:val="p"/>
-              </ns1:rPr>
+        <w:t xml:space="preserve">，一次项系数为</w:t>
+      </w:r>
+      <ns1:oMath>
+        <ns1:sSub>
+          <ns1:e>
+            <ns1:r>
               <ns1:t>b</ns1:t>
             </ns1:r>
-          </ns1:sub>
-        </ns1:sSub>
-      </ns1:oMath>
-      <w:r>
-        <w:t xml:space="preserve">，把搜索限制在</w:t>
-      </w:r>
-      <ns1:oMath>
-        <ns1:r>
-          <ns1:t>[</ns1:t>
+          </ns1:e>
+          <ns1:sub>
+            <ns1:r>
+              <ns1:t>1</ns1:t>
+            </ns1:r>
+          </ns1:sub>
+        </ns1:sSub>
+        <ns1:r>
+          <ns1:t>−</ns1:t>
+        </ns1:r>
+        <ns1:sSub>
+          <ns1:e>
+            <ns1:r>
+              <ns1:t>b</ns1:t>
+            </ns1:r>
+          </ns1:e>
+          <ns1:sub>
+            <ns1:r>
+              <ns1:t>2</ns1:t>
+            </ns1:r>
+          </ns1:sub>
+        </ns1:sSub>
+      </ns1:oMath>
+      <w:r>
+        <w:t xml:space="preserve">；</w:t>
+      </w:r>
+      <ns1:oMath>
+        <ns1:r>
+          <ns1:t>Q</ns1:t>
+        </ns1:r>
+      </ns1:oMath>
+      <w:r>
+        <w:t xml:space="preserve">的常数项为</w:t>
+      </w:r>
+      <w:r>
+        <w:t>b_2T^2/2</w:t>
+      </w:r>
+      <w:r>
+        <w:t xml:space="preserve">，一次项系数为</w:t>
+      </w:r>
+      <ns1:oMath>
+        <ns1:r>
+          <ns1:t>(</ns1:t>
+        </ns1:r>
+        <ns1:sSub>
+          <ns1:e>
+            <ns1:r>
+              <ns1:t>b</ns1:t>
+            </ns1:r>
+          </ns1:e>
+          <ns1:sub>
+            <ns1:r>
+              <ns1:t>1</ns1:t>
+            </ns1:r>
+          </ns1:sub>
+        </ns1:sSub>
+        <ns1:r>
+          <ns1:t>−</ns1:t>
+        </ns1:r>
+        <ns1:sSub>
+          <ns1:e>
+            <ns1:r>
+              <ns1:t>b</ns1:t>
+            </ns1:r>
+          </ns1:e>
+          <ns1:sub>
+            <ns1:r>
+              <ns1:t>2</ns1:t>
+            </ns1:r>
+          </ns1:sub>
+        </ns1:sSub>
+        <ns1:r>
+          <ns1:t>)</ns1:t>
+        </ns1:r>
+        <ns1:r>
+          <ns1:t>T</ns1:t>
+        </ns1:r>
+      </ns1:oMath>
+      <w:r>
+        <w:t xml:space="preserve">，二次项系数为</w:t>
+      </w:r>
+      <ns1:oMath>
+        <ns1:r>
+          <ns1:t>(</ns1:t>
+        </ns1:r>
+        <ns1:sSub>
+          <ns1:e>
+            <ns1:r>
+              <ns1:t>b</ns1:t>
+            </ns1:r>
+          </ns1:e>
+          <ns1:sub>
+            <ns1:r>
+              <ns1:t>2</ns1:t>
+            </ns1:r>
+          </ns1:sub>
+        </ns1:sSub>
+        <ns1:r>
+          <ns1:t>−</ns1:t>
+        </ns1:r>
+        <ns1:sSub>
+          <ns1:e>
+            <ns1:r>
+              <ns1:t>b</ns1:t>
+            </ns1:r>
+          </ns1:e>
+          <ns1:sub>
+            <ns1:r>
+              <ns1:t>1</ns1:t>
+            </ns1:r>
+          </ns1:sub>
+        </ns1:sSub>
+        <ns1:r>
+          <ns1:t>)</ns1:t>
+        </ns1:r>
+        <ns1:r>
+          <ns1:t>/</ns1:t>
+        </ns1:r>
+        <ns1:r>
+          <ns1:t>2</ns1:t>
+        </ns1:r>
+      </ns1:oMath>
+      <w:r>
+        <w:t xml:space="preserve">。将其代入消元关系后，统一改变整体符号，即得到前述三个同步系数。保留这一整体符号的一致性即可，不能分别改变单个系数的符号。</w:t>
+      </w:r>
+    </w:p>
+    <w:p>
+      <w:pPr>
+        <w:pStyle w:val="BodyText"/>
+      </w:pPr>
+      <w:r>
+        <w:t xml:space="preserve">当速度增量为零而位移余量也为零时，直接取零缩放量即可得到匀速可行解，任意允许的切换时刻都表示同一条运动。在这种情况下，消元多项式可能恒等于零，不能把它误判为无根，也不必尝试枚举无限多个切换时刻。可确定性地取零切换时刻并保存零实际加速度。若速度增量为零但位移余量非零，则缩放量不能为零，必须先由速度方程求出</w:t>
+      </w:r>
+      <ns1:oMath>
+        <ns1:r>
+          <ns1:t>L</ns1:t>
+        </ns1:r>
+        <ns1:r>
+          <ns1:t>=</ns1:t>
         </ns1:r>
         <ns1:r>
           <ns1:t>0</ns1:t>
         </ns1:r>
-        <ns1:r>
-          <ns1:t>,</ns1:t>
-        </ns1:r>
-        <ns1:sSub>
-          <ns1:e>
-            <ns1:r>
-              <ns1:t>T</ns1:t>
-            </ns1:r>
-          </ns1:e>
-          <ns1:sub>
-            <ns1:r>
-              <ns1:rPr>
-                <ns1:sty ns1:val="p"/>
-              </ns1:rPr>
-              <ns1:t>u</ns1:t>
-            </ns1:r>
-            <ns1:r>
-              <ns1:rPr>
-                <ns1:sty ns1:val="p"/>
-              </ns1:rPr>
-              <ns1:t>b</ns1:t>
-            </ns1:r>
-          </ns1:sub>
-        </ns1:sSub>
-        <ns1:r>
-          <ns1:t>]</ns1:t>
-        </ns1:r>
-      </ns1:oMath>
-      <w:r>
-        <w:t xml:space="preserve">。对每个轴均有</w:t>
-      </w:r>
-      <ns1:oMath>
-        <ns1:r>
-          <ns1:t>0</ns1:t>
-        </ns1:r>
-        <ns1:r>
-          <ns1:t>≤</ns1:t>
-        </ns1:r>
-        <ns1:sSub>
-          <ns1:e>
-            <ns1:r>
-              <ns1:t>τ</ns1:t>
-            </ns1:r>
-          </ns1:e>
-          <ns1:sub>
-            <ns1:r>
-              <ns1:t>r</ns1:t>
-            </ns1:r>
-          </ns1:sub>
-        </ns1:sSub>
-        <ns1:r>
-          <ns1:t>≤</ns1:t>
-        </ns1:r>
-        <ns1:r>
-          <ns1:t>T</ns1:t>
-        </ns1:r>
-      </ns1:oMath>
-      <w:r>
-        <w:t xml:space="preserve">和</w:t>
-      </w:r>
-      <ns1:oMath>
-        <ns1:r>
-          <ns1:t>0</ns1:t>
-        </ns1:r>
-        <ns1:r>
-          <ns1:t>≤</ns1:t>
-        </ns1:r>
-        <ns1:sSub>
-          <ns1:e>
-            <ns1:r>
-              <ns1:t>α</ns1:t>
-            </ns1:r>
-          </ns1:e>
-          <ns1:sub>
-            <ns1:r>
-              <ns1:t>r</ns1:t>
-            </ns1:r>
-          </ns1:sub>
-        </ns1:sSub>
-        <ns1:r>
-          <ns1:t>≤</ns1:t>
-        </ns1:r>
-        <ns1:r>
-          <ns1:t>1</ns1:t>
-        </ns1:r>
-      </ns1:oMath>
-      <w:r>
-        <w:t xml:space="preserve">，所以全部变量处于有界闭集；端点等式及加速度不等式的可行集合为闭集，因而在该紧集上的投影也是紧集。非空共同可行时间投影因此包含自身的最小元素。</w:t>
-      </w:r>
-    </w:p>
-    <w:p>
-      <w:pPr>
-        <w:pStyle w:val="BodyText"/>
-      </w:pPr>
-      <w:r>
-        <w:t xml:space="preserve">当两个或三个轴的独立最短时间相等时，无须用严格大于比较选出唯一</w:t>
+      </ns1:oMath>
+      <w:r>
+        <w:t xml:space="preserve">的切换时刻，再通过位移方程恢复缩放量。这些规则完整覆盖恒等式与零分母分支。</w:t>
+      </w:r>
+    </w:p>
+    <w:p>
+      <w:pPr>
+        <w:pStyle w:val="BodyText"/>
+      </w:pPr>
+      <w:r>
+        <w:t xml:space="preserve">当公共时间为零时，阶段时间和位移增量都只能为零，且起末速度必须一致。满足这些条件的轴可以用零加速度和零切换时刻表示；不满足则该轴在零时间不可行。对于静止轴，这一检查自然通过；对于带非零速度但起末状态相同的轴，也仅说明零时间的瞬时连接可行。程序应先处理此分支，再进行可能含时间或其他量作分母的计算。</w:t>
+      </w:r>
+    </w:p>
+    <w:p>
+      <w:pPr>
+        <w:pStyle w:val="Heading3"/>
+      </w:pPr>
+      <w:bookmarkStart w:id="35" w:name="共同可行集合求解的完备性与精度"/>
+      <w:r>
+        <w:t xml:space="preserve">10.2 共同可行集合求解的完备性与精度</w:t>
+      </w:r>
+      <w:bookmarkEnd w:id="35"/>
+    </w:p>
+    <w:p>
+      <w:pPr>
+        <w:pStyle w:val="FirstParagraph"/>
+      </w:pPr>
+      <w:r>
+        <w:t xml:space="preserve">对于某一固定顺序，各端点关系以及阶段时间、缩放量和加速度界均由多项式等式与不等式描述。其存在量词投影是时间实轴上的半代数集合，能够表示为有限个点与区间的组合。两种顺序的并集构成一个轴的可行时间集合，三个轴再取交集。求解时既要考虑有长度的可行区间，也要保留孤立可行点；仅在一组离散时间采样上搜索，可能跳过很窄的区间或孤立点，不能据此证明全局最小值。</w:t>
+      </w:r>
+    </w:p>
+    <w:p>
+      <w:pPr>
+        <w:pStyle w:val="BodyText"/>
+      </w:pPr>
+      <w:r>
+        <w:t xml:space="preserve">采用精确代数投影时，应针对原始联立条件处理全部变量，而不能仅将某个消元多项式的判别式为零作为唯一时间边界。边界还可能来自切换时刻达到零或总时间、缩放量达到零或一，以及退化等式的相容条件。完成投影后，按时间从小到大取得共同可行部分的第一个点，并恢复相应轴向参数。参数恢复与端点验证是必要步骤，用以建立边权和运动解的对应关系。</w:t>
+      </w:r>
+    </w:p>
+    <w:p>
+      <w:pPr>
+        <w:pStyle w:val="BodyText"/>
+      </w:pPr>
+      <w:r>
+        <w:t xml:space="preserve">采用区间分支定界时，已验证可行参数给出上界，剩余未排除区间给出可能更优时间的下界。只有证明区间不可行或不可能改善当前解时才可删除该区间。达到预设误差后，可返回可行上界及上下界差，明确其为具有时间误差界的近似边权。只有在各边求得精确最小值，或以精确代数数表示最小值时，后续图上结论才是数学意义的精确最优；采用近似边权时，应报告相应累计误差范围，不能把停止容差隐藏在</w:t>
       </w:r>
       <w:r>
         <w:t xml:space="preserve">“</w:t>
       </w:r>
       <w:r>
-        <w:t xml:space="preserve">主导轴</w:t>
+        <w:t xml:space="preserve">精确最优</w:t>
       </w:r>
       <w:r>
         <w:t xml:space="preserve">”</w:t>
       </w:r>
       <w:r>
-        <w:t xml:space="preserve">。只需把</w:t>
-      </w:r>
-      <ns1:oMath>
-        <ns1:sSub>
-          <ns1:e>
-            <ns1:r>
-              <ns1:t>T</ns1:t>
-            </ns1:r>
-          </ns1:e>
-          <ns1:sub>
-            <ns1:r>
-              <ns1:rPr>
-                <ns1:sty ns1:val="p"/>
-              </ns1:rPr>
-              <ns1:t>l</ns1:t>
-            </ns1:r>
-            <ns1:r>
-              <ns1:rPr>
-                <ns1:sty ns1:val="p"/>
-              </ns1:rPr>
-              <ns1:t>b</ns1:t>
-            </ns1:r>
-          </ns1:sub>
-        </ns1:sSub>
-      </ns1:oMath>
-      <w:r>
-        <w:t xml:space="preserve">作为共同可行性测试起点，并对每个轴独立保存该时刻的可行参数。若并列轴均采用其饱和最短时间解，则各自</w:t>
-      </w:r>
-      <ns1:oMath>
-        <ns1:r>
-          <ns1:t>α</ns1:t>
-        </ns1:r>
-        <ns1:r>
-          <ns1:t>=</ns1:t>
-        </ns1:r>
-        <ns1:r>
-          <ns1:t>1</ns1:t>
-        </ns1:r>
-      </ns1:oMath>
-      <w:r>
-        <w:t xml:space="preserve">；若某轴还存在另一组同时间可行参数，任选经完整验证且按确定规则排序的参数即可。由集合定义处理并列情形，不会出现因严格比较而没有坐标轴被赋值的问题。</w:t>
-      </w:r>
-    </w:p>
-    <w:p>
-      <w:pPr>
-        <w:pStyle w:val="Heading3"/>
-      </w:pPr>
-      <w:bookmarkStart w:id="34" w:name="固定时间消元的充分性与退化分支"/>
-      <w:r>
-        <w:t xml:space="preserve">10.1 固定时间消元的充分性与退化分支</w:t>
-      </w:r>
-      <w:bookmarkEnd w:id="34"/>
-    </w:p>
-    <w:p>
-      <w:pPr>
-        <w:pStyle w:val="FirstParagraph"/>
-      </w:pPr>
-      <w:r>
-        <w:t xml:space="preserve">固定时间消元多项式是两个端点方程的必要结果。它将缩放量消去，便于一次列出候选切换时刻，但仅满足该多项式还不足以判定轨迹可行：当消元中可能作为分母的量为零时，多项式可能丢失对缩放量的限制；当求得缩放量超出允许区间时，多项式依然可能等于零。因此，每个候选都必须回到两个原始端点方程，并同时验证时间区间、非负缩放量与实际加速度。</w:t>
-      </w:r>
-    </w:p>
-    <w:p>
-      <w:pPr>
-        <w:pStyle w:val="BodyText"/>
-      </w:pPr>
-      <w:r>
-        <w:t xml:space="preserve">固定时间方程的系数可通过把</w:t>
-      </w:r>
-      <ns1:oMath>
-        <ns1:r>
-          <ns1:t>L</ns1:t>
-        </ns1:r>
-      </ns1:oMath>
-      <w:r>
-        <w:t xml:space="preserve">展开成关于切换时刻的一次式、把</w:t>
-      </w:r>
-      <ns1:oMath>
-        <ns1:r>
-          <ns1:t>Q</ns1:t>
-        </ns1:r>
-      </ns1:oMath>
-      <w:r>
-        <w:t xml:space="preserve">展开成二次式得到。具体而言，</w:t>
-      </w:r>
-      <ns1:oMath>
-        <ns1:r>
-          <ns1:t>L</ns1:t>
-        </ns1:r>
-      </ns1:oMath>
-      <w:r>
-        <w:t xml:space="preserve">的常数项为</w:t>
-      </w:r>
-      <ns1:oMath>
-        <ns1:sSub>
-          <ns1:e>
-            <ns1:r>
-              <ns1:t>b</ns1:t>
-            </ns1:r>
-          </ns1:e>
-          <ns1:sub>
-            <ns1:r>
-              <ns1:t>2</ns1:t>
-            </ns1:r>
-          </ns1:sub>
-        </ns1:sSub>
-        <ns1:r>
-          <ns1:t>T</ns1:t>
-        </ns1:r>
-      </ns1:oMath>
-      <w:r>
-        <w:t xml:space="preserve">，一次项系数为</w:t>
-      </w:r>
-      <ns1:oMath>
-        <ns1:sSub>
-          <ns1:e>
-            <ns1:r>
-              <ns1:t>b</ns1:t>
-            </ns1:r>
-          </ns1:e>
-          <ns1:sub>
-            <ns1:r>
-              <ns1:t>1</ns1:t>
-            </ns1:r>
-          </ns1:sub>
-        </ns1:sSub>
-        <ns1:r>
-          <ns1:t>−</ns1:t>
-        </ns1:r>
-        <ns1:sSub>
-          <ns1:e>
-            <ns1:r>
-              <ns1:t>b</ns1:t>
-            </ns1:r>
-          </ns1:e>
-          <ns1:sub>
-            <ns1:r>
-              <ns1:t>2</ns1:t>
-            </ns1:r>
-          </ns1:sub>
-        </ns1:sSub>
-      </ns1:oMath>
-      <w:r>
-        <w:t xml:space="preserve">；</w:t>
-      </w:r>
-      <ns1:oMath>
-        <ns1:r>
-          <ns1:t>Q</ns1:t>
-        </ns1:r>
-      </ns1:oMath>
-      <w:r>
-        <w:t xml:space="preserve">的常数项为</w:t>
-      </w:r>
-      <w:r>
-        <w:t>b_2T^2/2</w:t>
-      </w:r>
-      <w:r>
-        <w:t xml:space="preserve">，一次项系数为</w:t>
-      </w:r>
-      <ns1:oMath>
-        <ns1:r>
-          <ns1:t>(</ns1:t>
-        </ns1:r>
-        <ns1:sSub>
-          <ns1:e>
-            <ns1:r>
-              <ns1:t>b</ns1:t>
-            </ns1:r>
-          </ns1:e>
-          <ns1:sub>
-            <ns1:r>
-              <ns1:t>1</ns1:t>
-            </ns1:r>
-          </ns1:sub>
-        </ns1:sSub>
-        <ns1:r>
-          <ns1:t>−</ns1:t>
-        </ns1:r>
-        <ns1:sSub>
-          <ns1:e>
-            <ns1:r>
-              <ns1:t>b</ns1:t>
-            </ns1:r>
-          </ns1:e>
-          <ns1:sub>
-            <ns1:r>
-              <ns1:t>2</ns1:t>
-            </ns1:r>
-          </ns1:sub>
-        </ns1:sSub>
-        <ns1:r>
-          <ns1:t>)</ns1:t>
-        </ns1:r>
-        <ns1:r>
-          <ns1:t>T</ns1:t>
-        </ns1:r>
-      </ns1:oMath>
-      <w:r>
-        <w:t xml:space="preserve">，二次项系数为</w:t>
-      </w:r>
-      <ns1:oMath>
-        <ns1:r>
-          <ns1:t>(</ns1:t>
-        </ns1:r>
-        <ns1:sSub>
-          <ns1:e>
-            <ns1:r>
-              <ns1:t>b</ns1:t>
-            </ns1:r>
-          </ns1:e>
-          <ns1:sub>
-            <ns1:r>
-              <ns1:t>2</ns1:t>
-            </ns1:r>
-          </ns1:sub>
-        </ns1:sSub>
-        <ns1:r>
-          <ns1:t>−</ns1:t>
-        </ns1:r>
-        <ns1:sSub>
-          <ns1:e>
-            <ns1:r>
-              <ns1:t>b</ns1:t>
-            </ns1:r>
-          </ns1:e>
-          <ns1:sub>
-            <ns1:r>
-              <ns1:t>1</ns1:t>
-            </ns1:r>
-          </ns1:sub>
-        </ns1:sSub>
-        <ns1:r>
-          <ns1:t>)</ns1:t>
-        </ns1:r>
-        <ns1:r>
-          <ns1:t>/</ns1:t>
-        </ns1:r>
-        <ns1:r>
-          <ns1:t>2</ns1:t>
-        </ns1:r>
-      </ns1:oMath>
-      <w:r>
-        <w:t xml:space="preserve">。将其代入消元关系后，统一改变整体符号，即得到前述三个同步系数。保留这一整体符号的一致性即可，不能分别改变单个系数的符号。</w:t>
-      </w:r>
-    </w:p>
-    <w:p>
-      <w:pPr>
-        <w:pStyle w:val="BodyText"/>
-      </w:pPr>
-      <w:r>
-        <w:t xml:space="preserve">当速度增量为零而位移余量也为零时，直接取零缩放量即可得到匀速可行解，任意允许的切换时刻都表示同一条运动。在这种情况下，消元多项式可能恒等于零，不能把它误判为无根，也不必尝试枚举无限多个切换时刻。可确定性地取零切换时刻并保存零实际加速度。若速度增量为零但位移余量非零，则缩放量不能为零，必须先由速度方程求出</w:t>
-      </w:r>
-      <ns1:oMath>
-        <ns1:r>
-          <ns1:t>L</ns1:t>
-        </ns1:r>
-        <ns1:r>
-          <ns1:t>=</ns1:t>
-        </ns1:r>
-        <ns1:r>
-          <ns1:t>0</ns1:t>
-        </ns1:r>
-      </ns1:oMath>
-      <w:r>
-        <w:t xml:space="preserve">的切换时刻，再通过位移方程恢复缩放量。这些规则完整覆盖恒等式与零分母分支。</w:t>
-      </w:r>
-    </w:p>
-    <w:p>
-      <w:pPr>
-        <w:pStyle w:val="BodyText"/>
-      </w:pPr>
-      <w:r>
-        <w:t xml:space="preserve">当公共时间为零时，阶段时间和位移增量都只能为零，且起末速度必须一致。满足这些条件的轴可以用零加速度和零切换时刻表示；不满足则该轴在零时间不可行。对于静止轴，这一检查自然通过；对于带非零速度但起末状态相同的轴，也仅说明零时间的瞬时连接可行。程序应先处理此分支，再进行可能含时间或其他量作分母的计算。</w:t>
-      </w:r>
-    </w:p>
-    <w:p>
-      <w:pPr>
-        <w:pStyle w:val="Heading3"/>
-      </w:pPr>
-      <w:bookmarkStart w:id="35" w:name="共同可行集合求解的完备性与精度"/>
-      <w:r>
-        <w:t xml:space="preserve">10.2 共同可行集合求解的完备性与精度</w:t>
-      </w:r>
-      <w:bookmarkEnd w:id="35"/>
-    </w:p>
-    <w:p>
-      <w:pPr>
-        <w:pStyle w:val="FirstParagraph"/>
-      </w:pPr>
-      <w:r>
-        <w:t xml:space="preserve">对于某一固定顺序，各端点关系以及阶段时间、缩放量和加速度界均由多项式等式与不等式描述。其存在量词投影是时间实轴上的半代数集合，能够表示为有限个点与区间的组合。两种顺序的并集构成一个轴的可行时间集合，三个轴再取交集。求解时既要考虑有长度的可行区间，也要保留孤立可行点；仅在一组离散时间采样上搜索，可能跳过很窄的区间或孤立点，不能据此证明全局最小值。</w:t>
-      </w:r>
-    </w:p>
-    <w:p>
-      <w:pPr>
-        <w:pStyle w:val="BodyText"/>
-      </w:pPr>
-      <w:r>
-        <w:t xml:space="preserve">采用精确代数投影时，应针对原始联立条件处理全部变量，而不能仅将某个消元多项式的判别式为零作为唯一时间边界。边界还可能来自切换时刻达到零或总时间、缩放量达到零或一，以及退化等式的相容条件。完成投影后，按时间从小到大取得共同可行部分的第一个点，并恢复相应轴向参数。参数恢复与端点验证是必要步骤，用以建立边权和运动解的对应关系。</w:t>
-      </w:r>
-    </w:p>
-    <w:p>
-      <w:pPr>
-        <w:pStyle w:val="BodyText"/>
-      </w:pPr>
-      <w:r>
-        <w:t xml:space="preserve">采用区间分支定界时，已验证可行参数给出上界，剩余未排除区间给出可能更优时间的下界。只有证明区间不可行或不可能改善当前解时才可删除该区间。达到预设误差后，可返回可行上界及上下界差，明确其为具有时间误差界的近似边权。只有在各边求得精确最小值，或以精确代数数表示最小值时，后续图上结论才是数学意义的精确最优；采用近似边权时，应报告相应累计误差范围，不能把停止容差隐藏在</w:t>
-      </w:r>
-      <w:r>
-        <w:t xml:space="preserve">“</w:t>
-      </w:r>
-      <w:r>
-        <w:t xml:space="preserve">精确最优</w:t>
-      </w:r>
-      <w:r>
-        <w:t xml:space="preserve">”</w:t>
-      </w:r>
-      <w:r>
         <w:t xml:space="preserve">表述内。</w:t>
       </w:r>
     </w:p>
@@ -7103,11 +6881,13 @@
       <w:pPr>
         <w:pStyle w:val="Heading2"/>
       </w:pPr>
+      <w:bookmarkStart w:id="57" w:name="DisclosureSection11"/>
       <w:bookmarkStart w:id="36" w:name="分层图动态规划与全局最优性证明"/>
       <w:r>
         <w:t xml:space="preserve">11. 分层图动态规划与全局最优性证明</w:t>
       </w:r>
       <w:bookmarkEnd w:id="36"/>
+      <w:bookmarkEnd w:id="57"/>
     </w:p>
     <w:p>
       <w:pPr>
@@ -7302,208 +7082,11 @@
     <w:p>
       <w:pPr>
         <w:pStyle w:val="BodyText"/>
-      </w:pPr>
-      <ns1:oMathPara>
-        <ns1:oMathParaPr>
-          <ns1:jc ns1:val="center"/>
-        </ns1:oMathParaPr>
-        <ns1:oMath>
-          <ns1:r>
-            <ns1:t>g</ns1:t>
-          </ns1:r>
-          <ns1:r>
-            <ns1:t>(</ns1:t>
-          </ns1:r>
-          <ns1:r>
-            <ns1:t>i</ns1:t>
-          </ns1:r>
-          <ns1:r>
-            <ns1:t>+</ns1:t>
-          </ns1:r>
-          <ns1:r>
-            <ns1:t>1</ns1:t>
-          </ns1:r>
-          <ns1:r>
-            <ns1:t>,</ns1:t>
-          </ns1:r>
-          <ns1:r>
-            <ns1:t>l</ns1:t>
-          </ns1:r>
-          <ns1:r>
-            <ns1:t>)</ns1:t>
-          </ns1:r>
-          <ns1:r>
-            <ns1:t>=</ns1:t>
-          </ns1:r>
-          <ns1:limLow>
-            <ns1:e>
-              <ns1:r>
-                <ns1:rPr>
-                  <ns1:nor/>
-                  <ns1:sty ns1:val="p"/>
-                </ns1:rPr>
-                <ns1:t>min</ns1:t>
-              </ns1:r>
-            </ns1:e>
-            <ns1:lim>
-              <ns1:r>
-                <ns1:t>k</ns1:t>
-              </ns1:r>
-              <ns1:r>
-                <ns1:t>:</ns1:t>
-              </ns1:r>
-              <ns1:r>
-                <ns1:t> </ns1:t>
-              </ns1:r>
-              <ns1:r>
-                <ns1:t>(</ns1:t>
-              </ns1:r>
-              <ns1:sSub>
-                <ns1:e>
-                  <ns1:r>
-                    <ns1:t>n</ns1:t>
-                  </ns1:r>
-                </ns1:e>
-                <ns1:sub>
-                  <ns1:r>
-                    <ns1:t>i</ns1:t>
-                  </ns1:r>
-                  <ns1:r>
-                    <ns1:t>,</ns1:t>
-                  </ns1:r>
-                  <ns1:r>
-                    <ns1:t>k</ns1:t>
-                  </ns1:r>
-                </ns1:sub>
-              </ns1:sSub>
-              <ns1:r>
-                <ns1:t>,</ns1:t>
-              </ns1:r>
-              <ns1:sSub>
-                <ns1:e>
-                  <ns1:r>
-                    <ns1:t>n</ns1:t>
-                  </ns1:r>
-                </ns1:e>
-                <ns1:sub>
-                  <ns1:r>
-                    <ns1:t>i</ns1:t>
-                  </ns1:r>
-                  <ns1:r>
-                    <ns1:t>+</ns1:t>
-                  </ns1:r>
-                  <ns1:r>
-                    <ns1:t>1</ns1:t>
-                  </ns1:r>
-                  <ns1:r>
-                    <ns1:t>,</ns1:t>
-                  </ns1:r>
-                  <ns1:r>
-                    <ns1:t>l</ns1:t>
-                  </ns1:r>
-                </ns1:sub>
-              </ns1:sSub>
-              <ns1:r>
-                <ns1:t>)</ns1:t>
-              </ns1:r>
-              <ns1:r>
-                <ns1:t>∈</ns1:t>
-              </ns1:r>
-              <ns1:r>
-                <ns1:rPr>
-                  <ns1:sty ns1:val="p"/>
-                  <ns1:scr ns1:val="script"/>
-                </ns1:rPr>
-                <ns1:t>E</ns1:t>
-              </ns1:r>
-            </ns1:lim>
-          </ns1:limLow>
-          <ns1:r>
-            <ns1:t>[</ns1:t>
-          </ns1:r>
-          <ns1:r>
-            <ns1:t>g</ns1:t>
-          </ns1:r>
-          <ns1:r>
-            <ns1:t>(</ns1:t>
-          </ns1:r>
-          <ns1:r>
-            <ns1:t>i</ns1:t>
-          </ns1:r>
-          <ns1:r>
-            <ns1:t>,</ns1:t>
-          </ns1:r>
-          <ns1:r>
-            <ns1:t>k</ns1:t>
-          </ns1:r>
-          <ns1:r>
-            <ns1:t>)</ns1:t>
-          </ns1:r>
-          <ns1:r>
-            <ns1:t>+</ns1:t>
-          </ns1:r>
-          <ns1:sSub>
-            <ns1:e>
-              <ns1:r>
-                <ns1:t>T</ns1:t>
-              </ns1:r>
-            </ns1:e>
-            <ns1:sub>
-              <ns1:r>
-                <ns1:rPr>
-                  <ns1:sty ns1:val="p"/>
-                </ns1:rPr>
-                <ns1:t>e</ns1:t>
-              </ns1:r>
-              <ns1:r>
-                <ns1:rPr>
-                  <ns1:sty ns1:val="p"/>
-                </ns1:rPr>
-                <ns1:t>d</ns1:t>
-              </ns1:r>
-              <ns1:r>
-                <ns1:rPr>
-                  <ns1:sty ns1:val="p"/>
-                </ns1:rPr>
-                <ns1:t>g</ns1:t>
-              </ns1:r>
-              <ns1:r>
-                <ns1:rPr>
-                  <ns1:sty ns1:val="p"/>
-                </ns1:rPr>
-                <ns1:t>e</ns1:t>
-              </ns1:r>
-            </ns1:sub>
-          </ns1:sSub>
-          <ns1:r>
-            <ns1:t>(</ns1:t>
-          </ns1:r>
-          <ns1:r>
-            <ns1:t>i</ns1:t>
-          </ns1:r>
-          <ns1:r>
-            <ns1:t>,</ns1:t>
-          </ns1:r>
-          <ns1:r>
-            <ns1:t>k</ns1:t>
-          </ns1:r>
-          <ns1:r>
-            <ns1:t>,</ns1:t>
-          </ns1:r>
-          <ns1:r>
-            <ns1:t>l</ns1:t>
-          </ns1:r>
-          <ns1:r>
-            <ns1:t>)</ns1:t>
-          </ns1:r>
-          <ns1:r>
-            <ns1:t>]</ns1:t>
-          </ns1:r>
-          <ns1:r>
-            <ns1:t>。</ns1:t>
-          </ns1:r>
-        </ns1:oMath>
-      </ns1:oMathPara>
+        <w:jc w:val="center"/>
+      </w:pPr>
+      <w:r>
+        <w:t>g(i+1,l)=mink: (n_i,k,n_i+1,l)∈E[g(i,k)+T_edge(i,k,l)]。</w:t>
+      </w:r>
     </w:p>
     <w:p>
       <w:pPr>
@@ -8207,11 +7790,13 @@
       <w:pPr>
         <w:pStyle w:val="Heading2"/>
       </w:pPr>
+      <w:bookmarkStart w:id="58" w:name="DisclosureSection12"/>
       <w:bookmarkStart w:id="38" w:name="轨迹解析重构及连续性说明"/>
       <w:r>
         <w:t xml:space="preserve">12. 轨迹解析重构及连续性说明</w:t>
       </w:r>
       <w:bookmarkEnd w:id="38"/>
+      <w:bookmarkEnd w:id="58"/>
     </w:p>
     <w:p>
       <w:pPr>
@@ -9228,11 +8813,13 @@
       <w:pPr>
         <w:pStyle w:val="Heading2"/>
       </w:pPr>
+      <w:bookmarkStart w:id="59" w:name="DisclosureSection13"/>
       <w:bookmarkStart w:id="40" w:name="退化情形数值容差和异常处理"/>
       <w:r>
         <w:t xml:space="preserve">13. 退化情形、数值容差和异常处理</w:t>
       </w:r>
       <w:bookmarkEnd w:id="40"/>
+      <w:bookmarkEnd w:id="59"/>
     </w:p>
     <w:p>
       <w:pPr>
@@ -9249,481 +8836,419 @@
       <w:r>
         <w:t xml:space="preserve">求解一元二次方程时，直接使用标准求根式可能在</w:t>
       </w:r>
-      <ns1:oMath>
-        <ns1:r>
-          <ns1:t>|</ns1:t>
-        </ns1:r>
+      <w:r>
+        <w:t>|B|</w:t>
+      </w:r>
+      <w:r>
+        <w:t xml:space="preserve">远大于</w:t>
+      </w:r>
+      <w:r>
+        <w:t>|A|</w:t>
+      </w:r>
+      <w:r>
+        <w:t xml:space="preserve">和</w:t>
+      </w:r>
+      <w:r>
+        <w:t>|C|</w:t>
+      </w:r>
+      <w:r>
+        <w:t xml:space="preserve">时产生消减误差。优选采用数值稳定求根方式，例如先计算</w:t>
+      </w:r>
+    </w:p>
+    <w:p>
+      <w:pPr>
+        <w:pStyle w:val="BodyText"/>
+        <w:jc w:val="center"/>
+      </w:pPr>
+      <w:r>
+        <w:t>q=−(1)/(2)(B+sgn_+(B)√(B^2−4AC))，</w:t>
+      </w:r>
+    </w:p>
+    <w:p>
+      <w:pPr>
+        <w:pStyle w:val="FirstParagraph"/>
+      </w:pPr>
+      <w:r>
+        <w:t xml:space="preserve">式中</w:t>
+      </w:r>
+      <w:r>
+        <w:t>sgn_+(B)</w:t>
+      </w:r>
+      <w:r>
+        <w:t xml:space="preserve">在</w:t>
+      </w:r>
+      <ns1:oMath>
         <ns1:r>
           <ns1:t>B</ns1:t>
         </ns1:r>
         <ns1:r>
-          <ns1:t>|</ns1:t>
-        </ns1:r>
-      </ns1:oMath>
-      <w:r>
-        <w:t xml:space="preserve">远大于</w:t>
-      </w:r>
-      <ns1:oMath>
-        <ns1:r>
-          <ns1:t>|</ns1:t>
+          <ns1:t>≥</ns1:t>
+        </ns1:r>
+        <ns1:r>
+          <ns1:t>0</ns1:t>
+        </ns1:r>
+      </ns1:oMath>
+      <w:r>
+        <w:t xml:space="preserve">时取一，在</w:t>
+      </w:r>
+      <ns1:oMath>
+        <ns1:r>
+          <ns1:t>B</ns1:t>
+        </ns1:r>
+        <ns1:r>
+          <ns1:t>&lt;</ns1:t>
+        </ns1:r>
+        <ns1:r>
+          <ns1:t>0</ns1:t>
+        </ns1:r>
+      </ns1:oMath>
+      <w:r>
+        <w:t xml:space="preserve">时取负一。若</w:t>
+      </w:r>
+      <ns1:oMath>
+        <ns1:r>
+          <ns1:t>q</ns1:t>
+        </ns1:r>
+        <ns1:r>
+          <ns1:t>≠</ns1:t>
+        </ns1:r>
+        <ns1:r>
+          <ns1:t>0</ns1:t>
+        </ns1:r>
+      </ns1:oMath>
+      <w:r>
+        <w:t xml:space="preserve">，再令两个根为</w:t>
+      </w:r>
+      <ns1:oMath>
+        <ns1:r>
+          <ns1:t>q</ns1:t>
+        </ns1:r>
+        <ns1:r>
+          <ns1:t>/</ns1:t>
         </ns1:r>
         <ns1:r>
           <ns1:t>A</ns1:t>
         </ns1:r>
-        <ns1:r>
-          <ns1:t>|</ns1:t>
-        </ns1:r>
       </ns1:oMath>
       <w:r>
         <w:t xml:space="preserve">和</w:t>
       </w:r>
       <ns1:oMath>
         <ns1:r>
-          <ns1:t>|</ns1:t>
-        </ns1:r>
-        <ns1:r>
           <ns1:t>C</ns1:t>
         </ns1:r>
         <ns1:r>
-          <ns1:t>|</ns1:t>
-        </ns1:r>
-      </ns1:oMath>
-      <w:r>
-        <w:t xml:space="preserve">时产生消减误差。优选采用数值稳定求根方式，例如先计算</w:t>
-      </w:r>
-    </w:p>
-    <w:p>
-      <w:pPr>
-        <w:pStyle w:val="BodyText"/>
-        <w:jc w:val="center"/>
-      </w:pPr>
-      <w:r>
-        <w:t>q=−(1)/(2)(B+sgn_+(B)√(B^2−4AC))，</w:t>
-      </w:r>
-    </w:p>
-    <w:p>
-      <w:pPr>
-        <w:pStyle w:val="FirstParagraph"/>
-      </w:pPr>
-      <w:r>
-        <w:t xml:space="preserve">式中</w:t>
-      </w:r>
-      <ns1:oMath>
-        <ns1:sSub>
-          <ns1:e>
-            <ns1:r>
-              <ns1:rPr>
-                <ns1:nor/>
-                <ns1:sty ns1:val="p"/>
-              </ns1:rPr>
-              <ns1:t>sgn</ns1:t>
-            </ns1:r>
-          </ns1:e>
-          <ns1:sub>
-            <ns1:r>
-              <ns1:t>+</ns1:t>
-            </ns1:r>
-          </ns1:sub>
-        </ns1:sSub>
+          <ns1:t>/</ns1:t>
+        </ns1:r>
+        <ns1:r>
+          <ns1:t>q</ns1:t>
+        </ns1:r>
+      </ns1:oMath>
+      <w:r>
+        <w:t xml:space="preserve">；若</w:t>
+      </w:r>
+      <ns1:oMath>
+        <ns1:r>
+          <ns1:t>q</ns1:t>
+        </ns1:r>
+        <ns1:r>
+          <ns1:t>=</ns1:t>
+        </ns1:r>
+        <ns1:r>
+          <ns1:t>0</ns1:t>
+        </ns1:r>
+      </ns1:oMath>
+      <w:r>
+        <w:t xml:space="preserve">，则按重根情形返回</w:t>
+      </w:r>
+      <ns1:oMath>
+        <ns1:r>
+          <ns1:t>−</ns1:t>
+        </ns1:r>
+        <ns1:r>
+          <ns1:t>B</ns1:t>
+        </ns1:r>
+        <ns1:r>
+          <ns1:t>/</ns1:t>
+        </ns1:r>
         <ns1:r>
           <ns1:t>(</ns1:t>
         </ns1:r>
         <ns1:r>
-          <ns1:t>B</ns1:t>
+          <ns1:t>2</ns1:t>
+        </ns1:r>
+        <ns1:r>
+          <ns1:t>A</ns1:t>
         </ns1:r>
         <ns1:r>
           <ns1:t>)</ns1:t>
         </ns1:r>
       </ns1:oMath>
       <w:r>
+        <w:t xml:space="preserve">，避免计算零除。该方式属于数值实现改进，不改变本发明由状态方程得到二次方程并筛选非负持续时间的基本原理。</w:t>
+      </w:r>
+    </w:p>
+    <w:p>
+      <w:pPr>
+        <w:pStyle w:val="BodyText"/>
+      </w:pPr>
+      <w:r>
+        <w:t xml:space="preserve">当</w:t>
+      </w:r>
+      <ns1:oMath>
+        <ns1:sSub>
+          <ns1:e>
+            <ns1:r>
+              <ns1:t>a</ns1:t>
+            </ns1:r>
+          </ns1:e>
+          <ns1:sub>
+            <ns1:r>
+              <ns1:t>2</ns1:t>
+            </ns1:r>
+          </ns1:sub>
+        </ns1:sSub>
+      </ns1:oMath>
+      <w:r>
+        <w:t xml:space="preserve">接近零时，利用末速度方程消去</w:t>
+      </w:r>
+      <ns1:oMath>
+        <ns1:sSub>
+          <ns1:e>
+            <ns1:r>
+              <ns1:t>t</ns1:t>
+            </ns1:r>
+          </ns1:e>
+          <ns1:sub>
+            <ns1:r>
+              <ns1:t>2</ns1:t>
+            </ns1:r>
+          </ns1:sub>
+        </ns1:sSub>
+      </ns1:oMath>
+      <w:r>
+        <w:t xml:space="preserve">会出现除零风险。可交换两个阶段，使非零加速度作为被除数对应阶段；也可以直接对线性速度约束和二次位移约束联合求解。如果某一轴的上下界均为零，则已经超出本方法的加速度边界前提，应作为输入不适用返回；对于单独扩展的匀速模型，需另行检查末速度等于初速度且位移与公共时间相容。</w:t>
+      </w:r>
+    </w:p>
+    <w:p>
+      <w:pPr>
+        <w:pStyle w:val="BodyText"/>
+      </w:pPr>
+      <w:r>
         <w:t xml:space="preserve">在</w:t>
       </w:r>
-      <ns1:oMath>
-        <ns1:r>
-          <ns1:t>B</ns1:t>
-        </ns1:r>
-        <ns1:r>
-          <ns1:t>≥</ns1:t>
-        </ns1:r>
+      <w:r>
+        <w:t>a^−&lt;0&lt;a^+</w:t>
+      </w:r>
+      <w:r>
+        <w:t xml:space="preserve">且端点数据有限的理想二阶积分模型中，系统可控，并存在某个充分长时间的有界加速度转移；其时间最优解属于已枚举的饱和切换结构。因此，两种顺序均无可行根通常表示输入边界不满足前提、数据非有限或数值求解失败。算法应返回明确异常并停止该边计算，不能使用未初始化持续时间继续形成三轴下界。与此不同，单轴各自可达仍不保证三个轴的规定同步控制族具有共同时间，后一情形按集合交集为空处理。</w:t>
+      </w:r>
+    </w:p>
+    <w:p>
+      <w:pPr>
+        <w:pStyle w:val="BodyText"/>
+      </w:pPr>
+      <w:r>
+        <w:t xml:space="preserve">当两种切换顺序均存在可行解时，应合并全部根并按总时间比较。切换顺序只用于生成候选，不构成高于时间目标的隐含优先级。除非在问题定义中另行加入并验证速度符号或位置区间约束，否则不能仅凭总时间比较推断中间速度不反向或中间位置始终位于两个航点之间；本文也不以这些约束作为删根依据。</w:t>
+      </w:r>
+    </w:p>
+    <w:p>
+      <w:pPr>
+        <w:pStyle w:val="BodyText"/>
+      </w:pPr>
+      <w:r>
+        <w:t xml:space="preserve">固定时间同步方程可能包含两个位于</w:t>
+      </w:r>
+      <w:r>
+        <w:t>[0,T]</w:t>
+      </w:r>
+      <w:r>
+        <w:t xml:space="preserve">内的根。应对每个根计算或联立求出</w:t>
+      </w:r>
+      <ns1:oMath>
+        <ns1:r>
+          <ns1:t>α</ns1:t>
+        </ns1:r>
+      </ns1:oMath>
+      <w:r>
+        <w:t xml:space="preserve">，并依据</w:t>
+      </w:r>
+      <ns1:oMath>
         <ns1:r>
           <ns1:t>0</ns1:t>
         </ns1:r>
-      </ns1:oMath>
-      <w:r>
-        <w:t xml:space="preserve">时取一，在</w:t>
-      </w:r>
-      <ns1:oMath>
-        <ns1:r>
-          <ns1:t>B</ns1:t>
-        </ns1:r>
-        <ns1:r>
-          <ns1:t>&lt;</ns1:t>
+        <ns1:r>
+          <ns1:t>≤</ns1:t>
+        </ns1:r>
+        <ns1:r>
+          <ns1:t>α</ns1:t>
+        </ns1:r>
+        <ns1:r>
+          <ns1:t>≤</ns1:t>
+        </ns1:r>
+        <ns1:r>
+          <ns1:t>1</ns1:t>
+        </ns1:r>
+      </ns1:oMath>
+      <w:r>
+        <w:t xml:space="preserve">、实际加速度界和两项端点残差筛选。若多个根均可行，可按切换时刻、加速度变化量和切换顺序组成确定性的次级排序；该排序只在同一最小公共时间的等价参数间选择，不改变边权。</w:t>
+      </w:r>
+    </w:p>
+    <w:p>
+      <w:pPr>
+        <w:pStyle w:val="BodyText"/>
+      </w:pPr>
+      <w:r>
+        <w:t xml:space="preserve">本方法对同一轴的两个名义边界使用同一非负缩放因子。这使固定时间下只需求一个切换时刻和一个缩放量，并确保缩放后加速度留在包含零的边界区间内。若改为两个独立缩放因子，未知量会增加且可行控制族发生改变，需要增加选择目标；所得共同时间可能不同，不能在同一次最优性证明中与本文控制族混用。</w:t>
+      </w:r>
+    </w:p>
+    <w:p>
+      <w:pPr>
+        <w:pStyle w:val="BodyText"/>
+      </w:pPr>
+      <w:r>
+        <w:t xml:space="preserve">若某轴可用零加速度匀速完成，即</w:t>
+      </w:r>
+      <ns1:oMath>
+        <ns1:sSub>
+          <ns1:e>
+            <ns1:r>
+              <ns1:t>v</ns1:t>
+            </ns1:r>
+          </ns1:e>
+          <ns1:sub>
+            <ns1:r>
+              <ns1:t>0</ns1:t>
+            </ns1:r>
+          </ns1:sub>
+        </ns1:sSub>
+        <ns1:r>
+          <ns1:t>=</ns1:t>
+        </ns1:r>
+        <ns1:sSub>
+          <ns1:e>
+            <ns1:r>
+              <ns1:t>v</ns1:t>
+            </ns1:r>
+          </ns1:e>
+          <ns1:sub>
+            <ns1:r>
+              <ns1:t>f</ns1:t>
+            </ns1:r>
+          </ns1:sub>
+        </ns1:sSub>
+      </ns1:oMath>
+      <w:r>
+        <w:t xml:space="preserve">且</w:t>
+      </w:r>
+      <ns1:oMath>
+        <ns1:r>
+          <ns1:t>d</ns1:t>
+        </ns1:r>
+        <ns1:r>
+          <ns1:t>=</ns1:t>
+        </ns1:r>
+        <ns1:sSub>
+          <ns1:e>
+            <ns1:r>
+              <ns1:t>v</ns1:t>
+            </ns1:r>
+          </ns1:e>
+          <ns1:sub>
+            <ns1:r>
+              <ns1:t>0</ns1:t>
+            </ns1:r>
+          </ns1:sub>
+        </ns1:sSub>
+        <ns1:r>
+          <ns1:t>T</ns1:t>
+        </ns1:r>
+      </ns1:oMath>
+      <w:r>
+        <w:t xml:space="preserve">，则固定时间</w:t>
+      </w:r>
+      <ns1:oMath>
+        <ns1:r>
+          <ns1:t>T</ns1:t>
+        </ns1:r>
+      </ns1:oMath>
+      <w:r>
+        <w:t xml:space="preserve">存在</w:t>
+      </w:r>
+      <ns1:oMath>
+        <ns1:r>
+          <ns1:t>α</ns1:t>
+        </ns1:r>
+        <ns1:r>
+          <ns1:t>=</ns1:t>
         </ns1:r>
         <ns1:r>
           <ns1:t>0</ns1:t>
         </ns1:r>
       </ns1:oMath>
       <w:r>
-        <w:t xml:space="preserve">时取负一。若</w:t>
-      </w:r>
-      <ns1:oMath>
-        <ns1:r>
-          <ns1:t>q</ns1:t>
-        </ns1:r>
-        <ns1:r>
-          <ns1:t>≠</ns1:t>
+        <w:t xml:space="preserve">的可行解；这不等于该轴在任意时间均可行。只有</w:t>
+      </w:r>
+      <ns1:oMath>
+        <ns1:r>
+          <ns1:t>d</ns1:t>
+        </ns1:r>
+        <ns1:r>
+          <ns1:t>=</ns1:t>
         </ns1:r>
         <ns1:r>
           <ns1:t>0</ns1:t>
         </ns1:r>
-      </ns1:oMath>
-      <w:r>
-        <w:t xml:space="preserve">，再令两个根为</w:t>
-      </w:r>
-      <ns1:oMath>
-        <ns1:r>
-          <ns1:t>q</ns1:t>
-        </ns1:r>
-        <ns1:r>
-          <ns1:t>/</ns1:t>
-        </ns1:r>
-        <ns1:r>
-          <ns1:t>A</ns1:t>
-        </ns1:r>
-      </ns1:oMath>
-      <w:r>
-        <w:t xml:space="preserve">和</w:t>
-      </w:r>
-      <ns1:oMath>
-        <ns1:r>
-          <ns1:t>C</ns1:t>
-        </ns1:r>
-        <ns1:r>
-          <ns1:t>/</ns1:t>
-        </ns1:r>
-        <ns1:r>
-          <ns1:t>q</ns1:t>
-        </ns1:r>
-      </ns1:oMath>
-      <w:r>
-        <w:t xml:space="preserve">；若</w:t>
-      </w:r>
-      <ns1:oMath>
-        <ns1:r>
-          <ns1:t>q</ns1:t>
-        </ns1:r>
+        <ns1:r>
+          <ns1:t>,</ns1:t>
+        </ns1:r>
+        <ns1:sSub>
+          <ns1:e>
+            <ns1:r>
+              <ns1:t>v</ns1:t>
+            </ns1:r>
+          </ns1:e>
+          <ns1:sub>
+            <ns1:r>
+              <ns1:t>0</ns1:t>
+            </ns1:r>
+          </ns1:sub>
+        </ns1:sSub>
         <ns1:r>
           <ns1:t>=</ns1:t>
         </ns1:r>
         <ns1:r>
           <ns1:t>0</ns1:t>
         </ns1:r>
-      </ns1:oMath>
-      <w:r>
-        <w:t xml:space="preserve">，则按重根情形返回</w:t>
-      </w:r>
-      <ns1:oMath>
-        <ns1:r>
-          <ns1:t>−</ns1:t>
-        </ns1:r>
-        <ns1:r>
-          <ns1:t>B</ns1:t>
-        </ns1:r>
-        <ns1:r>
-          <ns1:t>/</ns1:t>
-        </ns1:r>
-        <ns1:r>
-          <ns1:t>(</ns1:t>
-        </ns1:r>
-        <ns1:r>
-          <ns1:t>2</ns1:t>
-        </ns1:r>
-        <ns1:r>
-          <ns1:t>A</ns1:t>
-        </ns1:r>
-        <ns1:r>
-          <ns1:t>)</ns1:t>
-        </ns1:r>
-      </ns1:oMath>
-      <w:r>
-        <w:t xml:space="preserve">，避免计算零除。该方式属于数值实现改进，不改变本发明由状态方程得到二次方程并筛选非负持续时间的基本原理。</w:t>
-      </w:r>
-    </w:p>
-    <w:p>
-      <w:pPr>
-        <w:pStyle w:val="BodyText"/>
-      </w:pPr>
-      <w:r>
-        <w:t xml:space="preserve">当</w:t>
-      </w:r>
-      <ns1:oMath>
-        <ns1:sSub>
-          <ns1:e>
-            <ns1:r>
-              <ns1:t>a</ns1:t>
-            </ns1:r>
-          </ns1:e>
-          <ns1:sub>
-            <ns1:r>
-              <ns1:t>2</ns1:t>
-            </ns1:r>
-          </ns1:sub>
-        </ns1:sSub>
-      </ns1:oMath>
-      <w:r>
-        <w:t xml:space="preserve">接近零时，利用末速度方程消去</w:t>
-      </w:r>
-      <ns1:oMath>
-        <ns1:sSub>
-          <ns1:e>
-            <ns1:r>
-              <ns1:t>t</ns1:t>
-            </ns1:r>
-          </ns1:e>
-          <ns1:sub>
-            <ns1:r>
-              <ns1:t>2</ns1:t>
-            </ns1:r>
-          </ns1:sub>
-        </ns1:sSub>
-      </ns1:oMath>
-      <w:r>
-        <w:t xml:space="preserve">会出现除零风险。可交换两个阶段，使非零加速度作为被除数对应阶段；也可以直接对线性速度约束和二次位移约束联合求解。如果某一轴的上下界均为零，则已经超出本方法的加速度边界前提，应作为输入不适用返回；对于单独扩展的匀速模型，需另行检查末速度等于初速度且位移与公共时间相容。</w:t>
-      </w:r>
-    </w:p>
-    <w:p>
-      <w:pPr>
-        <w:pStyle w:val="BodyText"/>
-      </w:pPr>
-      <w:r>
-        <w:t xml:space="preserve">在</w:t>
-      </w:r>
-      <w:r>
-        <w:t>a^−&lt;0&lt;a^+</w:t>
-      </w:r>
-      <w:r>
-        <w:t xml:space="preserve">且端点数据有限的理想二阶积分模型中，系统可控，并存在某个充分长时间的有界加速度转移；其时间最优解属于已枚举的饱和切换结构。因此，两种顺序均无可行根通常表示输入边界不满足前提、数据非有限或数值求解失败。算法应返回明确异常并停止该边计算，不能使用未初始化持续时间继续形成三轴下界。与此不同，单轴各自可达仍不保证三个轴的规定同步控制族具有共同时间，后一情形按集合交集为空处理。</w:t>
-      </w:r>
-    </w:p>
-    <w:p>
-      <w:pPr>
-        <w:pStyle w:val="BodyText"/>
-      </w:pPr>
-      <w:r>
-        <w:t xml:space="preserve">当两种切换顺序均存在可行解时，应合并全部根并按总时间比较。切换顺序只用于生成候选，不构成高于时间目标的隐含优先级。除非在问题定义中另行加入并验证速度符号或位置区间约束，否则不能仅凭总时间比较推断中间速度不反向或中间位置始终位于两个航点之间；本文也不以这些约束作为删根依据。</w:t>
-      </w:r>
-    </w:p>
-    <w:p>
-      <w:pPr>
-        <w:pStyle w:val="BodyText"/>
-      </w:pPr>
-      <w:r>
-        <w:t xml:space="preserve">固定时间同步方程可能包含两个位于</w:t>
-      </w:r>
-      <ns1:oMath>
-        <ns1:r>
-          <ns1:t>[</ns1:t>
+        <ns1:r>
+          <ns1:t>,</ns1:t>
+        </ns1:r>
+        <ns1:sSub>
+          <ns1:e>
+            <ns1:r>
+              <ns1:t>v</ns1:t>
+            </ns1:r>
+          </ns1:e>
+          <ns1:sub>
+            <ns1:r>
+              <ns1:t>f</ns1:t>
+            </ns1:r>
+          </ns1:sub>
+        </ns1:sSub>
+        <ns1:r>
+          <ns1:t>=</ns1:t>
         </ns1:r>
         <ns1:r>
           <ns1:t>0</ns1:t>
         </ns1:r>
-        <ns1:r>
-          <ns1:t>,</ns1:t>
-        </ns1:r>
+      </ns1:oMath>
+      <w:r>
+        <w:t xml:space="preserve">时，零加速度才对所有非负</w:t>
+      </w:r>
+      <ns1:oMath>
         <ns1:r>
           <ns1:t>T</ns1:t>
         </ns1:r>
-        <ns1:r>
-          <ns1:t>]</ns1:t>
-        </ns1:r>
-      </ns1:oMath>
-      <w:r>
-        <w:t xml:space="preserve">内的根。应对每个根计算或联立求出</w:t>
-      </w:r>
-      <ns1:oMath>
-        <ns1:r>
-          <ns1:t>α</ns1:t>
-        </ns1:r>
-      </ns1:oMath>
-      <w:r>
-        <w:t xml:space="preserve">，并依据</w:t>
-      </w:r>
-      <ns1:oMath>
-        <ns1:r>
-          <ns1:t>0</ns1:t>
-        </ns1:r>
-        <ns1:r>
-          <ns1:t>≤</ns1:t>
-        </ns1:r>
-        <ns1:r>
-          <ns1:t>α</ns1:t>
-        </ns1:r>
-        <ns1:r>
-          <ns1:t>≤</ns1:t>
-        </ns1:r>
-        <ns1:r>
-          <ns1:t>1</ns1:t>
-        </ns1:r>
-      </ns1:oMath>
-      <w:r>
-        <w:t xml:space="preserve">、实际加速度界和两项端点残差筛选。若多个根均可行，可按切换时刻、加速度变化量和切换顺序组成确定性的次级排序；该排序只在同一最小公共时间的等价参数间选择，不改变边权。</w:t>
-      </w:r>
-    </w:p>
-    <w:p>
-      <w:pPr>
-        <w:pStyle w:val="BodyText"/>
-      </w:pPr>
-      <w:r>
-        <w:t xml:space="preserve">本方法对同一轴的两个名义边界使用同一非负缩放因子。这使固定时间下只需求一个切换时刻和一个缩放量，并确保缩放后加速度留在包含零的边界区间内。若改为两个独立缩放因子，未知量会增加且可行控制族发生改变，需要增加选择目标；所得共同时间可能不同，不能在同一次最优性证明中与本文控制族混用。</w:t>
-      </w:r>
-    </w:p>
-    <w:p>
-      <w:pPr>
-        <w:pStyle w:val="BodyText"/>
-      </w:pPr>
-      <w:r>
-        <w:t xml:space="preserve">若某轴可用零加速度匀速完成，即</w:t>
-      </w:r>
-      <ns1:oMath>
-        <ns1:sSub>
-          <ns1:e>
-            <ns1:r>
-              <ns1:t>v</ns1:t>
-            </ns1:r>
-          </ns1:e>
-          <ns1:sub>
-            <ns1:r>
-              <ns1:t>0</ns1:t>
-            </ns1:r>
-          </ns1:sub>
-        </ns1:sSub>
-        <ns1:r>
-          <ns1:t>=</ns1:t>
-        </ns1:r>
-        <ns1:sSub>
-          <ns1:e>
-            <ns1:r>
-              <ns1:t>v</ns1:t>
-            </ns1:r>
-          </ns1:e>
-          <ns1:sub>
-            <ns1:r>
-              <ns1:t>f</ns1:t>
-            </ns1:r>
-          </ns1:sub>
-        </ns1:sSub>
-      </ns1:oMath>
-      <w:r>
-        <w:t xml:space="preserve">且</w:t>
-      </w:r>
-      <ns1:oMath>
-        <ns1:r>
-          <ns1:t>d</ns1:t>
-        </ns1:r>
-        <ns1:r>
-          <ns1:t>=</ns1:t>
-        </ns1:r>
-        <ns1:sSub>
-          <ns1:e>
-            <ns1:r>
-              <ns1:t>v</ns1:t>
-            </ns1:r>
-          </ns1:e>
-          <ns1:sub>
-            <ns1:r>
-              <ns1:t>0</ns1:t>
-            </ns1:r>
-          </ns1:sub>
-        </ns1:sSub>
-        <ns1:r>
-          <ns1:t>T</ns1:t>
-        </ns1:r>
-      </ns1:oMath>
-      <w:r>
-        <w:t xml:space="preserve">，则固定时间</w:t>
-      </w:r>
-      <ns1:oMath>
-        <ns1:r>
-          <ns1:t>T</ns1:t>
-        </ns1:r>
-      </ns1:oMath>
-      <w:r>
-        <w:t xml:space="preserve">存在</w:t>
-      </w:r>
-      <ns1:oMath>
-        <ns1:r>
-          <ns1:t>α</ns1:t>
-        </ns1:r>
-        <ns1:r>
-          <ns1:t>=</ns1:t>
-        </ns1:r>
-        <ns1:r>
-          <ns1:t>0</ns1:t>
-        </ns1:r>
-      </ns1:oMath>
-      <w:r>
-        <w:t xml:space="preserve">的可行解；这不等于该轴在任意时间均可行。只有</w:t>
-      </w:r>
-      <ns1:oMath>
-        <ns1:r>
-          <ns1:t>d</ns1:t>
-        </ns1:r>
-        <ns1:r>
-          <ns1:t>=</ns1:t>
-        </ns1:r>
-        <ns1:r>
-          <ns1:t>0</ns1:t>
-        </ns1:r>
-        <ns1:r>
-          <ns1:t>,</ns1:t>
-        </ns1:r>
-        <ns1:sSub>
-          <ns1:e>
-            <ns1:r>
-              <ns1:t>v</ns1:t>
-            </ns1:r>
-          </ns1:e>
-          <ns1:sub>
-            <ns1:r>
-              <ns1:t>0</ns1:t>
-            </ns1:r>
-          </ns1:sub>
-        </ns1:sSub>
-        <ns1:r>
-          <ns1:t>=</ns1:t>
-        </ns1:r>
-        <ns1:r>
-          <ns1:t>0</ns1:t>
-        </ns1:r>
-        <ns1:r>
-          <ns1:t>,</ns1:t>
-        </ns1:r>
-        <ns1:sSub>
-          <ns1:e>
-            <ns1:r>
-              <ns1:t>v</ns1:t>
-            </ns1:r>
-          </ns1:e>
-          <ns1:sub>
-            <ns1:r>
-              <ns1:t>f</ns1:t>
-            </ns1:r>
-          </ns1:sub>
-        </ns1:sSub>
-        <ns1:r>
-          <ns1:t>=</ns1:t>
-        </ns1:r>
-        <ns1:r>
-          <ns1:t>0</ns1:t>
-        </ns1:r>
-      </ns1:oMath>
-      <w:r>
-        <w:t xml:space="preserve">时，零加速度才对所有非负</w:t>
-      </w:r>
-      <ns1:oMath>
-        <ns1:r>
-          <ns1:t>T</ns1:t>
-        </ns1:r>
       </ns1:oMath>
       <w:r>
         <w:t xml:space="preserve">均成立。其他零位移、等速度或零独立时长情形必须回到端点方程判断。</w:t>
@@ -9757,11 +9282,13 @@
       <w:pPr>
         <w:pStyle w:val="Heading2"/>
       </w:pPr>
+      <w:bookmarkStart w:id="60" w:name="DisclosureSection14"/>
       <w:bookmarkStart w:id="41" w:name="完整算法伪代码"/>
       <w:r>
         <w:t xml:space="preserve">14. 完整算法伪代码</w:t>
       </w:r>
       <w:bookmarkEnd w:id="41"/>
+      <w:bookmarkEnd w:id="60"/>
     </w:p>
     <w:p>
       <w:pPr>
@@ -11024,11 +10551,13 @@
       <w:pPr>
         <w:pStyle w:val="Heading2"/>
       </w:pPr>
+      <w:bookmarkStart w:id="61" w:name="DisclosureSection15"/>
       <w:bookmarkStart w:id="42" w:name="具体实施例"/>
       <w:r>
         <w:t xml:space="preserve">15. 具体实施例</w:t>
       </w:r>
       <w:bookmarkEnd w:id="42"/>
+      <w:bookmarkEnd w:id="61"/>
     </w:p>
     <w:p>
       <w:pPr>
@@ -11161,11 +10690,13 @@
       <w:pPr>
         <w:pStyle w:val="Heading2"/>
       </w:pPr>
+      <w:bookmarkStart w:id="62" w:name="DisclosureSection16"/>
       <w:bookmarkStart w:id="43" w:name="有益效果"/>
       <w:r>
         <w:t xml:space="preserve">16. 有益效果</w:t>
       </w:r>
       <w:bookmarkEnd w:id="43"/>
+      <w:bookmarkEnd w:id="62"/>
     </w:p>
     <w:p>
       <w:pPr>
@@ -11257,11 +10788,13 @@
       <w:pPr>
         <w:pStyle w:val="Heading2"/>
       </w:pPr>
+      <w:bookmarkStart w:id="63" w:name="DisclosureSection17"/>
       <w:bookmarkStart w:id="44" w:name="附图说明"/>
       <w:r>
         <w:t xml:space="preserve">17. 附图说明</w:t>
       </w:r>
       <w:bookmarkEnd w:id="44"/>
+      <w:bookmarkEnd w:id="63"/>
     </w:p>
     <w:p>
       <w:pPr>
@@ -11347,11 +10880,13 @@
       <w:pPr>
         <w:pStyle w:val="Heading2"/>
       </w:pPr>
+      <w:bookmarkStart w:id="64" w:name="DisclosureSection18"/>
       <w:bookmarkStart w:id="45" w:name="仿真验证与效果说明预留"/>
       <w:r>
         <w:t xml:space="preserve">18. 仿真验证与效果说明（预留）</w:t>
       </w:r>
       <w:bookmarkEnd w:id="45"/>
+      <w:bookmarkEnd w:id="64"/>
     </w:p>
     <w:p>
       <w:pPr>
@@ -11704,23 +11239,23 @@
   <w:style w:type="paragraph" w:default="1" w:styleId="Normal">
     <w:name w:val="Normal"/>
     <w:qFormat/>
+    <w:pPr>
+      <w:spacing w:line="360" w:lineRule="auto"/>
+      <w:ind w:firstLine="480"/>
+    </w:pPr>
     <w:rPr>
       <w:rFonts w:eastAsia="宋体" w:ascii="Times New Roman"/>
       <w:sz w:val="24"/>
     </w:rPr>
-    <w:pPr>
-      <w:spacing w:line="360" w:lineRule="auto"/>
-      <w:ind w:firstLine="480"/>
-    </w:pPr>
   </w:style>
   <w:style w:type="paragraph" w:styleId="BodyText">
     <w:name w:val="Body Text"/>
     <w:basedOn w:val="Normal"/>
     <w:link w:val="BodyTextChar"/>
+    <w:qFormat/>
     <w:pPr>
       <w:spacing w:before="180" w:after="180"/>
     </w:pPr>
-    <w:qFormat/>
   </w:style>
   <w:style w:type="paragraph" w:customStyle="1" w:styleId="FirstParagraph">
     <w:name w:val="First Paragraph"/>

</xml_diff>